<commit_message>
Penambahan migrasi semua tabel
</commit_message>
<xml_diff>
--- a/Tugas 4/3124500036_Muhammad Yoga Ananda Satria_CURD .docx
+++ b/Tugas 4/3124500036_Muhammad Yoga Ananda Satria_CURD .docx
@@ -290,29 +290,22 @@
     <w:p>
       <w:pPr>
         <w:rPr>
-          <w:sz w:val="32"/>
-          <w:szCs w:val="32"/>
-        </w:rPr>
-      </w:pPr>
-    </w:p>
-    <w:p>
-      <w:pPr>
-        <w:rPr>
-          <w:rFonts w:ascii="Times New Roman" w:hAnsi="Times New Roman" w:cs="Times New Roman"/>
-          <w:b/>
-          <w:bCs/>
-          <w:sz w:val="32"/>
-          <w:szCs w:val="32"/>
-        </w:rPr>
-      </w:pPr>
-      <w:r>
-        <w:rPr>
-          <w:rFonts w:ascii="Times New Roman" w:hAnsi="Times New Roman" w:cs="Times New Roman"/>
-          <w:b/>
-          <w:bCs/>
-          <w:sz w:val="32"/>
-          <w:szCs w:val="32"/>
-        </w:rPr>
+          <w:rFonts w:ascii="Times New Roman" w:hAnsi="Times New Roman" w:cs="Times New Roman"/>
+          <w:b/>
+          <w:bCs/>
+          <w:sz w:val="32"/>
+          <w:szCs w:val="32"/>
+        </w:rPr>
+      </w:pPr>
+      <w:r>
+        <w:rPr>
+          <w:rFonts w:ascii="Times New Roman" w:hAnsi="Times New Roman" w:cs="Times New Roman"/>
+          <w:b/>
+          <w:bCs/>
+          <w:sz w:val="32"/>
+          <w:szCs w:val="32"/>
+        </w:rPr>
+        <w:lastRenderedPageBreak/>
         <w:t>A.</w:t>
       </w:r>
       <w:r>
@@ -348,6 +341,301 @@
     </w:p>
     <w:p>
       <w:pPr>
+        <w:pStyle w:val="ListParagraph"/>
+        <w:numPr>
+          <w:ilvl w:val="0"/>
+          <w:numId w:val="14"/>
+        </w:numPr>
+        <w:rPr>
+          <w:rFonts w:ascii="Times New Roman" w:hAnsi="Times New Roman" w:cs="Times New Roman"/>
+          <w:sz w:val="28"/>
+          <w:szCs w:val="28"/>
+        </w:rPr>
+      </w:pPr>
+      <w:r>
+        <w:rPr>
+          <w:rFonts w:ascii="Times New Roman" w:hAnsi="Times New Roman" w:cs="Times New Roman"/>
+          <w:sz w:val="28"/>
+          <w:szCs w:val="28"/>
+        </w:rPr>
+        <w:t xml:space="preserve">Memahami konsep </w:t>
+      </w:r>
+    </w:p>
+    <w:p>
+      <w:pPr>
+        <w:rPr>
+          <w:rFonts w:ascii="Times New Roman" w:hAnsi="Times New Roman" w:cs="Times New Roman"/>
+          <w:sz w:val="28"/>
+          <w:szCs w:val="28"/>
+        </w:rPr>
+      </w:pPr>
+      <w:r>
+        <w:rPr>
+          <w:rFonts w:ascii="Times New Roman" w:hAnsi="Times New Roman" w:cs="Times New Roman"/>
+          <w:b/>
+          <w:bCs/>
+          <w:sz w:val="28"/>
+          <w:szCs w:val="28"/>
+        </w:rPr>
+        <w:t>CRUD (</w:t>
+      </w:r>
+      <w:r>
+        <w:rPr>
+          <w:rFonts w:ascii="Times New Roman" w:hAnsi="Times New Roman" w:cs="Times New Roman"/>
+          <w:b/>
+          <w:bCs/>
+          <w:i/>
+          <w:iCs/>
+          <w:sz w:val="28"/>
+          <w:szCs w:val="28"/>
+        </w:rPr>
+        <w:t>Create, Read, Update, Delete</w:t>
+      </w:r>
+      <w:r>
+        <w:rPr>
+          <w:rFonts w:ascii="Times New Roman" w:hAnsi="Times New Roman" w:cs="Times New Roman"/>
+          <w:b/>
+          <w:bCs/>
+          <w:sz w:val="28"/>
+          <w:szCs w:val="28"/>
+        </w:rPr>
+        <w:t>)</w:t>
+      </w:r>
+      <w:r>
+        <w:rPr>
+          <w:rFonts w:ascii="Times New Roman" w:hAnsi="Times New Roman" w:cs="Times New Roman"/>
+          <w:sz w:val="28"/>
+          <w:szCs w:val="28"/>
+        </w:rPr>
+        <w:t xml:space="preserve"> dalam pengembangan aplikasi berbasis </w:t>
+      </w:r>
+      <w:r>
+        <w:rPr>
+          <w:rFonts w:ascii="Times New Roman" w:hAnsi="Times New Roman" w:cs="Times New Roman"/>
+          <w:i/>
+          <w:iCs/>
+          <w:sz w:val="28"/>
+          <w:szCs w:val="28"/>
+        </w:rPr>
+        <w:t>web</w:t>
+      </w:r>
+      <w:r>
+        <w:rPr>
+          <w:rFonts w:ascii="Times New Roman" w:hAnsi="Times New Roman" w:cs="Times New Roman"/>
+          <w:sz w:val="28"/>
+          <w:szCs w:val="28"/>
+        </w:rPr>
+        <w:t>.</w:t>
+      </w:r>
+    </w:p>
+    <w:p>
+      <w:pPr>
+        <w:pStyle w:val="ListParagraph"/>
+        <w:numPr>
+          <w:ilvl w:val="0"/>
+          <w:numId w:val="14"/>
+        </w:numPr>
+        <w:rPr>
+          <w:rFonts w:ascii="Times New Roman" w:hAnsi="Times New Roman" w:cs="Times New Roman"/>
+          <w:sz w:val="28"/>
+          <w:szCs w:val="28"/>
+        </w:rPr>
+      </w:pPr>
+      <w:r>
+        <w:rPr>
+          <w:rFonts w:ascii="Times New Roman" w:hAnsi="Times New Roman" w:cs="Times New Roman"/>
+          <w:sz w:val="28"/>
+          <w:szCs w:val="28"/>
+        </w:rPr>
+        <w:t xml:space="preserve">Mampu mengimplementasikan fungsionalitas CRUD menggunakan </w:t>
+      </w:r>
+    </w:p>
+    <w:p>
+      <w:pPr>
+        <w:rPr>
+          <w:rFonts w:ascii="Times New Roman" w:hAnsi="Times New Roman" w:cs="Times New Roman"/>
+          <w:sz w:val="28"/>
+          <w:szCs w:val="28"/>
+        </w:rPr>
+      </w:pPr>
+      <w:r>
+        <w:rPr>
+          <w:rFonts w:ascii="Times New Roman" w:hAnsi="Times New Roman" w:cs="Times New Roman"/>
+          <w:i/>
+          <w:iCs/>
+          <w:sz w:val="28"/>
+          <w:szCs w:val="28"/>
+        </w:rPr>
+        <w:t>framework</w:t>
+      </w:r>
+      <w:r>
+        <w:rPr>
+          <w:rFonts w:ascii="Times New Roman" w:hAnsi="Times New Roman" w:cs="Times New Roman"/>
+          <w:sz w:val="28"/>
+          <w:szCs w:val="28"/>
+        </w:rPr>
+        <w:t xml:space="preserve"> </w:t>
+      </w:r>
+      <w:r>
+        <w:rPr>
+          <w:rFonts w:ascii="Times New Roman" w:hAnsi="Times New Roman" w:cs="Times New Roman"/>
+          <w:b/>
+          <w:bCs/>
+          <w:sz w:val="28"/>
+          <w:szCs w:val="28"/>
+        </w:rPr>
+        <w:t>Laravel</w:t>
+      </w:r>
+      <w:r>
+        <w:rPr>
+          <w:rFonts w:ascii="Times New Roman" w:hAnsi="Times New Roman" w:cs="Times New Roman"/>
+          <w:sz w:val="28"/>
+          <w:szCs w:val="28"/>
+        </w:rPr>
+        <w:t>.</w:t>
+      </w:r>
+    </w:p>
+    <w:p>
+      <w:pPr>
+        <w:pStyle w:val="ListParagraph"/>
+        <w:numPr>
+          <w:ilvl w:val="0"/>
+          <w:numId w:val="14"/>
+        </w:numPr>
+        <w:rPr>
+          <w:rFonts w:ascii="Times New Roman" w:hAnsi="Times New Roman" w:cs="Times New Roman"/>
+          <w:sz w:val="28"/>
+          <w:szCs w:val="28"/>
+        </w:rPr>
+      </w:pPr>
+      <w:r>
+        <w:rPr>
+          <w:rFonts w:ascii="Times New Roman" w:hAnsi="Times New Roman" w:cs="Times New Roman"/>
+          <w:sz w:val="28"/>
+          <w:szCs w:val="28"/>
+        </w:rPr>
+        <w:t xml:space="preserve">Mampu menyiapkan dan menggunakan </w:t>
+      </w:r>
+    </w:p>
+    <w:p>
+      <w:pPr>
+        <w:rPr>
+          <w:rFonts w:ascii="Times New Roman" w:hAnsi="Times New Roman" w:cs="Times New Roman"/>
+          <w:sz w:val="28"/>
+          <w:szCs w:val="28"/>
+        </w:rPr>
+      </w:pPr>
+      <w:r>
+        <w:rPr>
+          <w:rFonts w:ascii="Times New Roman" w:hAnsi="Times New Roman" w:cs="Times New Roman"/>
+          <w:b/>
+          <w:bCs/>
+          <w:i/>
+          <w:iCs/>
+          <w:sz w:val="28"/>
+          <w:szCs w:val="28"/>
+        </w:rPr>
+        <w:t>master layout</w:t>
+      </w:r>
+      <w:r>
+        <w:rPr>
+          <w:rFonts w:ascii="Times New Roman" w:hAnsi="Times New Roman" w:cs="Times New Roman"/>
+          <w:b/>
+          <w:bCs/>
+          <w:sz w:val="28"/>
+          <w:szCs w:val="28"/>
+        </w:rPr>
+        <w:t xml:space="preserve"> (Blade Template)</w:t>
+      </w:r>
+      <w:r>
+        <w:rPr>
+          <w:rFonts w:ascii="Times New Roman" w:hAnsi="Times New Roman" w:cs="Times New Roman"/>
+          <w:sz w:val="28"/>
+          <w:szCs w:val="28"/>
+        </w:rPr>
+        <w:t xml:space="preserve"> untuk konsistensi tampilan aplikasi.</w:t>
+      </w:r>
+    </w:p>
+    <w:p>
+      <w:pPr>
+        <w:pStyle w:val="ListParagraph"/>
+        <w:numPr>
+          <w:ilvl w:val="0"/>
+          <w:numId w:val="14"/>
+        </w:numPr>
+        <w:rPr>
+          <w:rFonts w:ascii="Times New Roman" w:hAnsi="Times New Roman" w:cs="Times New Roman"/>
+          <w:sz w:val="28"/>
+          <w:szCs w:val="28"/>
+        </w:rPr>
+      </w:pPr>
+      <w:r>
+        <w:rPr>
+          <w:rFonts w:ascii="Times New Roman" w:hAnsi="Times New Roman" w:cs="Times New Roman"/>
+          <w:sz w:val="28"/>
+          <w:szCs w:val="28"/>
+        </w:rPr>
+        <w:t>Mampu menampilkan dan mengelola data pegawai (</w:t>
+      </w:r>
+    </w:p>
+    <w:p>
+      <w:pPr>
+        <w:pStyle w:val="ListParagraph"/>
+        <w:ind w:left="360"/>
+        <w:rPr>
+          <w:rFonts w:ascii="Times New Roman" w:hAnsi="Times New Roman" w:cs="Times New Roman"/>
+          <w:sz w:val="28"/>
+          <w:szCs w:val="28"/>
+        </w:rPr>
+      </w:pPr>
+      <w:r>
+        <w:rPr>
+          <w:rFonts w:ascii="Times New Roman" w:hAnsi="Times New Roman" w:cs="Times New Roman"/>
+          <w:i/>
+          <w:iCs/>
+          <w:sz w:val="28"/>
+          <w:szCs w:val="28"/>
+        </w:rPr>
+        <w:t>employee</w:t>
+      </w:r>
+      <w:r>
+        <w:rPr>
+          <w:rFonts w:ascii="Times New Roman" w:hAnsi="Times New Roman" w:cs="Times New Roman"/>
+          <w:sz w:val="28"/>
+          <w:szCs w:val="28"/>
+        </w:rPr>
+        <w:t xml:space="preserve">) melalui antarmuka </w:t>
+      </w:r>
+      <w:r>
+        <w:rPr>
+          <w:rFonts w:ascii="Times New Roman" w:hAnsi="Times New Roman" w:cs="Times New Roman"/>
+          <w:i/>
+          <w:iCs/>
+          <w:sz w:val="28"/>
+          <w:szCs w:val="28"/>
+        </w:rPr>
+        <w:t>web</w:t>
+      </w:r>
+      <w:r>
+        <w:rPr>
+          <w:rFonts w:ascii="Times New Roman" w:hAnsi="Times New Roman" w:cs="Times New Roman"/>
+          <w:sz w:val="28"/>
+          <w:szCs w:val="28"/>
+        </w:rPr>
+        <w:t>.</w:t>
+      </w:r>
+    </w:p>
+    <w:p>
+      <w:pPr>
+        <w:rPr>
+          <w:rFonts w:ascii="Times New Roman" w:hAnsi="Times New Roman" w:cs="Times New Roman"/>
+          <w:sz w:val="32"/>
+          <w:szCs w:val="32"/>
+        </w:rPr>
+      </w:pPr>
+    </w:p>
+    <w:p>
+      <w:pPr>
         <w:rPr>
           <w:rFonts w:ascii="Times New Roman" w:hAnsi="Times New Roman" w:cs="Times New Roman"/>
           <w:b/>
@@ -371,21 +659,640 @@
       <w:pPr>
         <w:rPr>
           <w:rFonts w:ascii="Times New Roman" w:hAnsi="Times New Roman" w:cs="Times New Roman"/>
-          <w:b/>
-          <w:bCs/>
-          <w:sz w:val="32"/>
-          <w:szCs w:val="32"/>
-        </w:rPr>
-      </w:pPr>
-      <w:r>
-        <w:rPr>
-          <w:rFonts w:ascii="Times New Roman" w:hAnsi="Times New Roman" w:cs="Times New Roman"/>
-          <w:b/>
-          <w:bCs/>
-          <w:sz w:val="32"/>
-          <w:szCs w:val="32"/>
-        </w:rPr>
-        <w:t>C</w:t>
+          <w:sz w:val="28"/>
+          <w:szCs w:val="28"/>
+        </w:rPr>
+      </w:pPr>
+      <w:r>
+        <w:rPr>
+          <w:rFonts w:ascii="Times New Roman" w:hAnsi="Times New Roman" w:cs="Times New Roman"/>
+          <w:sz w:val="28"/>
+          <w:szCs w:val="28"/>
+        </w:rPr>
+        <w:t>1.</w:t>
+      </w:r>
+      <w:r>
+        <w:rPr>
+          <w:rFonts w:ascii="Times New Roman" w:hAnsi="Times New Roman" w:cs="Times New Roman"/>
+          <w:sz w:val="28"/>
+          <w:szCs w:val="28"/>
+        </w:rPr>
+        <w:t xml:space="preserve">  </w:t>
+      </w:r>
+      <w:r>
+        <w:rPr>
+          <w:rFonts w:ascii="Times New Roman" w:hAnsi="Times New Roman" w:cs="Times New Roman"/>
+          <w:b/>
+          <w:bCs/>
+          <w:sz w:val="28"/>
+          <w:szCs w:val="28"/>
+        </w:rPr>
+        <w:t>CRUD (</w:t>
+      </w:r>
+      <w:r>
+        <w:rPr>
+          <w:rFonts w:ascii="Times New Roman" w:hAnsi="Times New Roman" w:cs="Times New Roman"/>
+          <w:b/>
+          <w:bCs/>
+          <w:i/>
+          <w:iCs/>
+          <w:sz w:val="28"/>
+          <w:szCs w:val="28"/>
+        </w:rPr>
+        <w:t>Create, Read, Update, Delete</w:t>
+      </w:r>
+      <w:r>
+        <w:rPr>
+          <w:rFonts w:ascii="Times New Roman" w:hAnsi="Times New Roman" w:cs="Times New Roman"/>
+          <w:b/>
+          <w:bCs/>
+          <w:sz w:val="28"/>
+          <w:szCs w:val="28"/>
+        </w:rPr>
+        <w:t>)</w:t>
+      </w:r>
+      <w:r>
+        <w:rPr>
+          <w:rFonts w:ascii="Times New Roman" w:hAnsi="Times New Roman" w:cs="Times New Roman"/>
+          <w:sz w:val="28"/>
+          <w:szCs w:val="28"/>
+        </w:rPr>
+        <w:t>: Konsep dasar dalam pengelolaan data pada basis data.</w:t>
+      </w:r>
+    </w:p>
+    <w:p>
+      <w:pPr>
+        <w:numPr>
+          <w:ilvl w:val="0"/>
+          <w:numId w:val="19"/>
+        </w:numPr>
+        <w:rPr>
+          <w:rFonts w:ascii="Times New Roman" w:hAnsi="Times New Roman" w:cs="Times New Roman"/>
+          <w:sz w:val="28"/>
+          <w:szCs w:val="28"/>
+        </w:rPr>
+      </w:pPr>
+      <w:r>
+        <w:rPr>
+          <w:rFonts w:ascii="Times New Roman" w:hAnsi="Times New Roman" w:cs="Times New Roman"/>
+          <w:b/>
+          <w:bCs/>
+          <w:sz w:val="28"/>
+          <w:szCs w:val="28"/>
+        </w:rPr>
+        <w:t>Create</w:t>
+      </w:r>
+      <w:r>
+        <w:rPr>
+          <w:rFonts w:ascii="Times New Roman" w:hAnsi="Times New Roman" w:cs="Times New Roman"/>
+          <w:sz w:val="28"/>
+          <w:szCs w:val="28"/>
+        </w:rPr>
+        <w:t>: Operasi untuk membuat data baru (misalnya, membuat data pegawai baru).</w:t>
+      </w:r>
+    </w:p>
+    <w:p>
+      <w:pPr>
+        <w:numPr>
+          <w:ilvl w:val="0"/>
+          <w:numId w:val="19"/>
+        </w:numPr>
+        <w:rPr>
+          <w:rFonts w:ascii="Times New Roman" w:hAnsi="Times New Roman" w:cs="Times New Roman"/>
+          <w:sz w:val="28"/>
+          <w:szCs w:val="28"/>
+        </w:rPr>
+      </w:pPr>
+      <w:r>
+        <w:rPr>
+          <w:rFonts w:ascii="Times New Roman" w:hAnsi="Times New Roman" w:cs="Times New Roman"/>
+          <w:b/>
+          <w:bCs/>
+          <w:sz w:val="28"/>
+          <w:szCs w:val="28"/>
+        </w:rPr>
+        <w:t>Read</w:t>
+      </w:r>
+      <w:r>
+        <w:rPr>
+          <w:rFonts w:ascii="Times New Roman" w:hAnsi="Times New Roman" w:cs="Times New Roman"/>
+          <w:sz w:val="28"/>
+          <w:szCs w:val="28"/>
+        </w:rPr>
+        <w:t>: Operasi untuk menampilkan atau membaca data (misalnya, menampilkan daftar pegawai ).</w:t>
+      </w:r>
+    </w:p>
+    <w:p>
+      <w:pPr>
+        <w:numPr>
+          <w:ilvl w:val="0"/>
+          <w:numId w:val="19"/>
+        </w:numPr>
+        <w:rPr>
+          <w:rFonts w:ascii="Times New Roman" w:hAnsi="Times New Roman" w:cs="Times New Roman"/>
+          <w:sz w:val="28"/>
+          <w:szCs w:val="28"/>
+        </w:rPr>
+      </w:pPr>
+      <w:r>
+        <w:rPr>
+          <w:rFonts w:ascii="Times New Roman" w:hAnsi="Times New Roman" w:cs="Times New Roman"/>
+          <w:b/>
+          <w:bCs/>
+          <w:sz w:val="28"/>
+          <w:szCs w:val="28"/>
+        </w:rPr>
+        <w:t>Update</w:t>
+      </w:r>
+      <w:r>
+        <w:rPr>
+          <w:rFonts w:ascii="Times New Roman" w:hAnsi="Times New Roman" w:cs="Times New Roman"/>
+          <w:sz w:val="28"/>
+          <w:szCs w:val="28"/>
+        </w:rPr>
+        <w:t>: Operasi untuk mengubah data yang sudah ada (misalnya, mengedit data pegawai ).</w:t>
+      </w:r>
+    </w:p>
+    <w:p>
+      <w:pPr>
+        <w:numPr>
+          <w:ilvl w:val="0"/>
+          <w:numId w:val="19"/>
+        </w:numPr>
+        <w:rPr>
+          <w:rFonts w:ascii="Times New Roman" w:hAnsi="Times New Roman" w:cs="Times New Roman"/>
+          <w:sz w:val="28"/>
+          <w:szCs w:val="28"/>
+        </w:rPr>
+      </w:pPr>
+      <w:r>
+        <w:rPr>
+          <w:rFonts w:ascii="Times New Roman" w:hAnsi="Times New Roman" w:cs="Times New Roman"/>
+          <w:b/>
+          <w:bCs/>
+          <w:sz w:val="28"/>
+          <w:szCs w:val="28"/>
+        </w:rPr>
+        <w:t>Delete</w:t>
+      </w:r>
+      <w:r>
+        <w:rPr>
+          <w:rFonts w:ascii="Times New Roman" w:hAnsi="Times New Roman" w:cs="Times New Roman"/>
+          <w:sz w:val="28"/>
+          <w:szCs w:val="28"/>
+        </w:rPr>
+        <w:t>: Operasi untuk menghapus data (misalnya, menghapus data pegawai ).</w:t>
+      </w:r>
+    </w:p>
+    <w:p>
+      <w:pPr>
+        <w:rPr>
+          <w:rFonts w:ascii="Times New Roman" w:hAnsi="Times New Roman" w:cs="Times New Roman"/>
+          <w:sz w:val="28"/>
+          <w:szCs w:val="28"/>
+        </w:rPr>
+      </w:pPr>
+      <w:r>
+        <w:rPr>
+          <w:rFonts w:ascii="Times New Roman" w:hAnsi="Times New Roman" w:cs="Times New Roman"/>
+          <w:sz w:val="28"/>
+          <w:szCs w:val="28"/>
+        </w:rPr>
+        <w:t>2.</w:t>
+      </w:r>
+      <w:r>
+        <w:rPr>
+          <w:rFonts w:ascii="Times New Roman" w:hAnsi="Times New Roman" w:cs="Times New Roman"/>
+          <w:sz w:val="28"/>
+          <w:szCs w:val="28"/>
+        </w:rPr>
+        <w:t xml:space="preserve">  </w:t>
+      </w:r>
+      <w:r>
+        <w:rPr>
+          <w:rFonts w:ascii="Times New Roman" w:hAnsi="Times New Roman" w:cs="Times New Roman"/>
+          <w:b/>
+          <w:bCs/>
+          <w:sz w:val="28"/>
+          <w:szCs w:val="28"/>
+        </w:rPr>
+        <w:t>Laravel</w:t>
+      </w:r>
+      <w:r>
+        <w:rPr>
+          <w:rFonts w:ascii="Times New Roman" w:hAnsi="Times New Roman" w:cs="Times New Roman"/>
+          <w:sz w:val="28"/>
+          <w:szCs w:val="28"/>
+        </w:rPr>
+        <w:t xml:space="preserve">: </w:t>
+      </w:r>
+      <w:r>
+        <w:rPr>
+          <w:rFonts w:ascii="Times New Roman" w:hAnsi="Times New Roman" w:cs="Times New Roman"/>
+          <w:i/>
+          <w:iCs/>
+          <w:sz w:val="28"/>
+          <w:szCs w:val="28"/>
+        </w:rPr>
+        <w:t>Framework</w:t>
+      </w:r>
+      <w:r>
+        <w:rPr>
+          <w:rFonts w:ascii="Times New Roman" w:hAnsi="Times New Roman" w:cs="Times New Roman"/>
+          <w:sz w:val="28"/>
+          <w:szCs w:val="28"/>
+        </w:rPr>
+        <w:t xml:space="preserve"> PHP yang menggunakan arsitektur </w:t>
+      </w:r>
+      <w:r>
+        <w:rPr>
+          <w:rFonts w:ascii="Times New Roman" w:hAnsi="Times New Roman" w:cs="Times New Roman"/>
+          <w:b/>
+          <w:bCs/>
+          <w:sz w:val="28"/>
+          <w:szCs w:val="28"/>
+        </w:rPr>
+        <w:t>MVC (</w:t>
+      </w:r>
+      <w:r>
+        <w:rPr>
+          <w:rFonts w:ascii="Times New Roman" w:hAnsi="Times New Roman" w:cs="Times New Roman"/>
+          <w:b/>
+          <w:bCs/>
+          <w:i/>
+          <w:iCs/>
+          <w:sz w:val="28"/>
+          <w:szCs w:val="28"/>
+        </w:rPr>
+        <w:t>Model-View-Controller</w:t>
+      </w:r>
+      <w:r>
+        <w:rPr>
+          <w:rFonts w:ascii="Times New Roman" w:hAnsi="Times New Roman" w:cs="Times New Roman"/>
+          <w:b/>
+          <w:bCs/>
+          <w:sz w:val="28"/>
+          <w:szCs w:val="28"/>
+        </w:rPr>
+        <w:t>)</w:t>
+      </w:r>
+      <w:r>
+        <w:rPr>
+          <w:rFonts w:ascii="Times New Roman" w:hAnsi="Times New Roman" w:cs="Times New Roman"/>
+          <w:sz w:val="28"/>
+          <w:szCs w:val="28"/>
+        </w:rPr>
+        <w:t xml:space="preserve"> untuk membangun aplikasi </w:t>
+      </w:r>
+      <w:r>
+        <w:rPr>
+          <w:rFonts w:ascii="Times New Roman" w:hAnsi="Times New Roman" w:cs="Times New Roman"/>
+          <w:i/>
+          <w:iCs/>
+          <w:sz w:val="28"/>
+          <w:szCs w:val="28"/>
+        </w:rPr>
+        <w:t>web</w:t>
+      </w:r>
+      <w:r>
+        <w:rPr>
+          <w:rFonts w:ascii="Times New Roman" w:hAnsi="Times New Roman" w:cs="Times New Roman"/>
+          <w:sz w:val="28"/>
+          <w:szCs w:val="28"/>
+        </w:rPr>
+        <w:t xml:space="preserve"> yang kompleks.</w:t>
+      </w:r>
+    </w:p>
+    <w:p>
+      <w:pPr>
+        <w:rPr>
+          <w:rFonts w:ascii="Times New Roman" w:hAnsi="Times New Roman" w:cs="Times New Roman"/>
+          <w:sz w:val="28"/>
+          <w:szCs w:val="28"/>
+        </w:rPr>
+      </w:pPr>
+      <w:r>
+        <w:rPr>
+          <w:rFonts w:ascii="Times New Roman" w:hAnsi="Times New Roman" w:cs="Times New Roman"/>
+          <w:sz w:val="28"/>
+          <w:szCs w:val="28"/>
+        </w:rPr>
+        <w:t>3.</w:t>
+      </w:r>
+      <w:r>
+        <w:rPr>
+          <w:rFonts w:ascii="Times New Roman" w:hAnsi="Times New Roman" w:cs="Times New Roman"/>
+          <w:sz w:val="28"/>
+          <w:szCs w:val="28"/>
+        </w:rPr>
+        <w:t xml:space="preserve">  </w:t>
+      </w:r>
+      <w:r>
+        <w:rPr>
+          <w:rFonts w:ascii="Times New Roman" w:hAnsi="Times New Roman" w:cs="Times New Roman"/>
+          <w:b/>
+          <w:bCs/>
+          <w:sz w:val="28"/>
+          <w:szCs w:val="28"/>
+        </w:rPr>
+        <w:t>Blade Template Engine</w:t>
+      </w:r>
+      <w:r>
+        <w:rPr>
+          <w:rFonts w:ascii="Times New Roman" w:hAnsi="Times New Roman" w:cs="Times New Roman"/>
+          <w:sz w:val="28"/>
+          <w:szCs w:val="28"/>
+        </w:rPr>
+        <w:t xml:space="preserve">: </w:t>
+      </w:r>
+      <w:r>
+        <w:rPr>
+          <w:rFonts w:ascii="Times New Roman" w:hAnsi="Times New Roman" w:cs="Times New Roman"/>
+          <w:i/>
+          <w:iCs/>
+          <w:sz w:val="28"/>
+          <w:szCs w:val="28"/>
+        </w:rPr>
+        <w:t>Templating engine</w:t>
+      </w:r>
+      <w:r>
+        <w:rPr>
+          <w:rFonts w:ascii="Times New Roman" w:hAnsi="Times New Roman" w:cs="Times New Roman"/>
+          <w:sz w:val="28"/>
+          <w:szCs w:val="28"/>
+        </w:rPr>
+        <w:t xml:space="preserve"> yang digunakan Laravel untuk mendefinisikan </w:t>
+      </w:r>
+      <w:r>
+        <w:rPr>
+          <w:rFonts w:ascii="Times New Roman" w:hAnsi="Times New Roman" w:cs="Times New Roman"/>
+          <w:i/>
+          <w:iCs/>
+          <w:sz w:val="28"/>
+          <w:szCs w:val="28"/>
+        </w:rPr>
+        <w:t>view</w:t>
+      </w:r>
+      <w:r>
+        <w:rPr>
+          <w:rFonts w:ascii="Times New Roman" w:hAnsi="Times New Roman" w:cs="Times New Roman"/>
+          <w:sz w:val="28"/>
+          <w:szCs w:val="28"/>
+        </w:rPr>
+        <w:t xml:space="preserve">. Fitur utamanya adalah </w:t>
+      </w:r>
+    </w:p>
+    <w:p>
+      <w:pPr>
+        <w:rPr>
+          <w:rFonts w:ascii="Times New Roman" w:hAnsi="Times New Roman" w:cs="Times New Roman"/>
+          <w:sz w:val="28"/>
+          <w:szCs w:val="28"/>
+        </w:rPr>
+      </w:pPr>
+      <w:r>
+        <w:rPr>
+          <w:rFonts w:ascii="Times New Roman" w:hAnsi="Times New Roman" w:cs="Times New Roman"/>
+          <w:b/>
+          <w:bCs/>
+          <w:sz w:val="28"/>
+          <w:szCs w:val="28"/>
+        </w:rPr>
+        <w:t>@extends</w:t>
+      </w:r>
+      <w:r>
+        <w:rPr>
+          <w:rFonts w:ascii="Times New Roman" w:hAnsi="Times New Roman" w:cs="Times New Roman"/>
+          <w:sz w:val="28"/>
+          <w:szCs w:val="28"/>
+        </w:rPr>
+        <w:t xml:space="preserve"> (untuk mewarisi </w:t>
+      </w:r>
+      <w:r>
+        <w:rPr>
+          <w:rFonts w:ascii="Times New Roman" w:hAnsi="Times New Roman" w:cs="Times New Roman"/>
+          <w:i/>
+          <w:iCs/>
+          <w:sz w:val="28"/>
+          <w:szCs w:val="28"/>
+        </w:rPr>
+        <w:t>layout</w:t>
+      </w:r>
+      <w:r>
+        <w:rPr>
+          <w:rFonts w:ascii="Times New Roman" w:hAnsi="Times New Roman" w:cs="Times New Roman"/>
+          <w:sz w:val="28"/>
+          <w:szCs w:val="28"/>
+        </w:rPr>
+        <w:t xml:space="preserve"> dari </w:t>
+      </w:r>
+      <w:r>
+        <w:rPr>
+          <w:rFonts w:ascii="Times New Roman" w:hAnsi="Times New Roman" w:cs="Times New Roman"/>
+          <w:i/>
+          <w:iCs/>
+          <w:sz w:val="28"/>
+          <w:szCs w:val="28"/>
+        </w:rPr>
+        <w:t>file</w:t>
+      </w:r>
+      <w:r>
+        <w:rPr>
+          <w:rFonts w:ascii="Times New Roman" w:hAnsi="Times New Roman" w:cs="Times New Roman"/>
+          <w:sz w:val="28"/>
+          <w:szCs w:val="28"/>
+        </w:rPr>
+        <w:t xml:space="preserve"> lain), </w:t>
+      </w:r>
+      <w:r>
+        <w:rPr>
+          <w:rFonts w:ascii="Times New Roman" w:hAnsi="Times New Roman" w:cs="Times New Roman"/>
+          <w:b/>
+          <w:bCs/>
+          <w:sz w:val="28"/>
+          <w:szCs w:val="28"/>
+        </w:rPr>
+        <w:t>@yield</w:t>
+      </w:r>
+      <w:r>
+        <w:rPr>
+          <w:rFonts w:ascii="Times New Roman" w:hAnsi="Times New Roman" w:cs="Times New Roman"/>
+          <w:sz w:val="28"/>
+          <w:szCs w:val="28"/>
+        </w:rPr>
+        <w:t xml:space="preserve"> (untuk mendefinisikan bagian yang akan diisi), dan </w:t>
+      </w:r>
+      <w:r>
+        <w:rPr>
+          <w:rFonts w:ascii="Times New Roman" w:hAnsi="Times New Roman" w:cs="Times New Roman"/>
+          <w:b/>
+          <w:bCs/>
+          <w:sz w:val="28"/>
+          <w:szCs w:val="28"/>
+        </w:rPr>
+        <w:t>@section</w:t>
+      </w:r>
+      <w:r>
+        <w:rPr>
+          <w:rFonts w:ascii="Times New Roman" w:hAnsi="Times New Roman" w:cs="Times New Roman"/>
+          <w:sz w:val="28"/>
+          <w:szCs w:val="28"/>
+        </w:rPr>
+        <w:t xml:space="preserve"> (untuk mengisi bagian yang di-</w:t>
+      </w:r>
+      <w:r>
+        <w:rPr>
+          <w:rFonts w:ascii="Times New Roman" w:hAnsi="Times New Roman" w:cs="Times New Roman"/>
+          <w:i/>
+          <w:iCs/>
+          <w:sz w:val="28"/>
+          <w:szCs w:val="28"/>
+        </w:rPr>
+        <w:t>yield</w:t>
+      </w:r>
+      <w:r>
+        <w:rPr>
+          <w:rFonts w:ascii="Times New Roman" w:hAnsi="Times New Roman" w:cs="Times New Roman"/>
+          <w:sz w:val="28"/>
+          <w:szCs w:val="28"/>
+        </w:rPr>
+        <w:t>).</w:t>
+      </w:r>
+    </w:p>
+    <w:p>
+      <w:pPr>
+        <w:rPr>
+          <w:rFonts w:ascii="Times New Roman" w:hAnsi="Times New Roman" w:cs="Times New Roman"/>
+          <w:sz w:val="32"/>
+          <w:szCs w:val="32"/>
+        </w:rPr>
+      </w:pPr>
+    </w:p>
+    <w:p>
+      <w:pPr>
+        <w:rPr>
+          <w:rFonts w:ascii="Times New Roman" w:hAnsi="Times New Roman" w:cs="Times New Roman"/>
+          <w:b/>
+          <w:bCs/>
+          <w:sz w:val="32"/>
+          <w:szCs w:val="32"/>
+        </w:rPr>
+      </w:pPr>
+      <w:r>
+        <w:rPr>
+          <w:rFonts w:ascii="Times New Roman" w:hAnsi="Times New Roman" w:cs="Times New Roman"/>
+          <w:b/>
+          <w:bCs/>
+          <w:sz w:val="32"/>
+          <w:szCs w:val="32"/>
+        </w:rPr>
+        <w:t>C.Tugas</w:t>
+      </w:r>
+    </w:p>
+    <w:p>
+      <w:pPr>
+        <w:rPr>
+          <w:rFonts w:ascii="Times New Roman" w:hAnsi="Times New Roman" w:cs="Times New Roman"/>
+          <w:sz w:val="32"/>
+          <w:szCs w:val="32"/>
+        </w:rPr>
+      </w:pPr>
+      <w:r>
+        <w:rPr>
+          <w:rFonts w:ascii="Times New Roman" w:hAnsi="Times New Roman" w:cs="Times New Roman"/>
+          <w:sz w:val="32"/>
+          <w:szCs w:val="32"/>
+        </w:rPr>
+        <w:t>1. Kerjakan Percobaan di atas</w:t>
+      </w:r>
+    </w:p>
+    <w:p>
+      <w:pPr>
+        <w:rPr>
+          <w:rFonts w:ascii="Times New Roman" w:hAnsi="Times New Roman" w:cs="Times New Roman"/>
+          <w:sz w:val="32"/>
+          <w:szCs w:val="32"/>
+        </w:rPr>
+      </w:pPr>
+      <w:r>
+        <w:rPr>
+          <w:rFonts w:ascii="Times New Roman" w:hAnsi="Times New Roman" w:cs="Times New Roman"/>
+          <w:sz w:val="32"/>
+          <w:szCs w:val="32"/>
+        </w:rPr>
+        <w:t>2. Lakukan commit pada lokal repository anda pada branch dev dengan perintah git add .</w:t>
+      </w:r>
+    </w:p>
+    <w:p>
+      <w:pPr>
+        <w:rPr>
+          <w:rFonts w:ascii="Times New Roman" w:hAnsi="Times New Roman" w:cs="Times New Roman"/>
+          <w:sz w:val="32"/>
+          <w:szCs w:val="32"/>
+        </w:rPr>
+      </w:pPr>
+      <w:r>
+        <w:rPr>
+          <w:rFonts w:ascii="Times New Roman" w:hAnsi="Times New Roman" w:cs="Times New Roman"/>
+          <w:sz w:val="32"/>
+          <w:szCs w:val="32"/>
+        </w:rPr>
+        <w:t>selanjutnya git commit -m ”Penambahan Master Layout”</w:t>
+      </w:r>
+    </w:p>
+    <w:p>
+      <w:pPr>
+        <w:rPr>
+          <w:rFonts w:ascii="Times New Roman" w:hAnsi="Times New Roman" w:cs="Times New Roman"/>
+          <w:sz w:val="32"/>
+          <w:szCs w:val="32"/>
+        </w:rPr>
+      </w:pPr>
+      <w:r>
+        <w:rPr>
+          <w:rFonts w:ascii="Times New Roman" w:hAnsi="Times New Roman" w:cs="Times New Roman"/>
+          <w:sz w:val="32"/>
+          <w:szCs w:val="32"/>
+        </w:rPr>
+        <w:t>3. Push ke remote repository anda. Pastikan sudah di branch dev lalu jalankan perintah push</w:t>
+      </w:r>
+    </w:p>
+    <w:p>
+      <w:pPr>
+        <w:rPr>
+          <w:rFonts w:ascii="Times New Roman" w:hAnsi="Times New Roman" w:cs="Times New Roman"/>
+          <w:sz w:val="32"/>
+          <w:szCs w:val="32"/>
+        </w:rPr>
+      </w:pPr>
+      <w:r>
+        <w:rPr>
+          <w:rFonts w:ascii="Times New Roman" w:hAnsi="Times New Roman" w:cs="Times New Roman"/>
+          <w:sz w:val="32"/>
+          <w:szCs w:val="32"/>
+        </w:rPr>
+        <w:t>origin dev</w:t>
+      </w:r>
+    </w:p>
+    <w:p>
+      <w:pPr>
+        <w:rPr>
+          <w:rFonts w:ascii="Times New Roman" w:hAnsi="Times New Roman" w:cs="Times New Roman"/>
+          <w:b/>
+          <w:bCs/>
+          <w:sz w:val="32"/>
+          <w:szCs w:val="32"/>
+        </w:rPr>
+      </w:pPr>
+      <w:r>
+        <w:rPr>
+          <w:rFonts w:ascii="Times New Roman" w:hAnsi="Times New Roman" w:cs="Times New Roman"/>
+          <w:b/>
+          <w:bCs/>
+          <w:sz w:val="32"/>
+          <w:szCs w:val="32"/>
+        </w:rPr>
+        <w:t>D</w:t>
       </w:r>
       <w:r>
         <w:rPr>
@@ -465,6 +1372,7 @@
       <w:r>
         <w:rPr>
           <w:rFonts w:ascii="Times New Roman" w:hAnsi="Times New Roman" w:cs="Times New Roman"/>
+          <w:noProof/>
           <w:sz w:val="32"/>
           <w:szCs w:val="32"/>
         </w:rPr>
@@ -513,12 +1421,22 @@
           <w:szCs w:val="32"/>
         </w:rPr>
       </w:pPr>
-      <w:r>
-        <w:rPr>
-          <w:rFonts w:ascii="Times New Roman" w:hAnsi="Times New Roman" w:cs="Times New Roman"/>
-          <w:sz w:val="32"/>
-          <w:szCs w:val="32"/>
-        </w:rPr>
+    </w:p>
+    <w:p>
+      <w:pPr>
+        <w:rPr>
+          <w:rFonts w:ascii="Times New Roman" w:hAnsi="Times New Roman" w:cs="Times New Roman"/>
+          <w:sz w:val="32"/>
+          <w:szCs w:val="32"/>
+        </w:rPr>
+      </w:pPr>
+      <w:r>
+        <w:rPr>
+          <w:rFonts w:ascii="Times New Roman" w:hAnsi="Times New Roman" w:cs="Times New Roman"/>
+          <w:sz w:val="32"/>
+          <w:szCs w:val="32"/>
+        </w:rPr>
+        <w:lastRenderedPageBreak/>
         <w:t>Penjelasan:</w:t>
       </w:r>
     </w:p>
@@ -526,16 +1444,581 @@
       <w:pPr>
         <w:rPr>
           <w:rFonts w:ascii="Times New Roman" w:hAnsi="Times New Roman" w:cs="Times New Roman"/>
-          <w:sz w:val="32"/>
-          <w:szCs w:val="32"/>
-        </w:rPr>
-      </w:pPr>
-      <w:r>
-        <w:rPr>
-          <w:rFonts w:ascii="Times New Roman" w:hAnsi="Times New Roman" w:cs="Times New Roman"/>
-          <w:sz w:val="32"/>
-          <w:szCs w:val="32"/>
-        </w:rPr>
+          <w:sz w:val="28"/>
+          <w:szCs w:val="28"/>
+        </w:rPr>
+      </w:pPr>
+      <w:r>
+        <w:rPr>
+          <w:rFonts w:ascii="Times New Roman" w:hAnsi="Times New Roman" w:cs="Times New Roman"/>
+          <w:b/>
+          <w:bCs/>
+          <w:sz w:val="28"/>
+          <w:szCs w:val="28"/>
+        </w:rPr>
+        <w:t>master.blade.php</w:t>
+      </w:r>
+      <w:r>
+        <w:rPr>
+          <w:rFonts w:ascii="Times New Roman" w:hAnsi="Times New Roman" w:cs="Times New Roman"/>
+          <w:sz w:val="28"/>
+          <w:szCs w:val="28"/>
+        </w:rPr>
+        <w:t xml:space="preserve"> berfungsi sebagai </w:t>
+      </w:r>
+      <w:r>
+        <w:rPr>
+          <w:rFonts w:ascii="Times New Roman" w:hAnsi="Times New Roman" w:cs="Times New Roman"/>
+          <w:b/>
+          <w:bCs/>
+          <w:sz w:val="28"/>
+          <w:szCs w:val="28"/>
+        </w:rPr>
+        <w:t>Master Layout</w:t>
+      </w:r>
+      <w:r>
+        <w:rPr>
+          <w:rFonts w:ascii="Times New Roman" w:hAnsi="Times New Roman" w:cs="Times New Roman"/>
+          <w:sz w:val="28"/>
+          <w:szCs w:val="28"/>
+        </w:rPr>
+        <w:t xml:space="preserve"> atau </w:t>
+      </w:r>
+      <w:r>
+        <w:rPr>
+          <w:rFonts w:ascii="Times New Roman" w:hAnsi="Times New Roman" w:cs="Times New Roman"/>
+          <w:i/>
+          <w:iCs/>
+          <w:sz w:val="28"/>
+          <w:szCs w:val="28"/>
+        </w:rPr>
+        <w:t>template</w:t>
+      </w:r>
+      <w:r>
+        <w:rPr>
+          <w:rFonts w:ascii="Times New Roman" w:hAnsi="Times New Roman" w:cs="Times New Roman"/>
+          <w:sz w:val="28"/>
+          <w:szCs w:val="28"/>
+        </w:rPr>
+        <w:t xml:space="preserve"> utama aplikasi. Tujuannya adalah memastikan semua halaman memiliki struktur dasar dan header/footer yang seragam.</w:t>
+      </w:r>
+    </w:p>
+    <w:p>
+      <w:pPr>
+        <w:rPr>
+          <w:rFonts w:ascii="Times New Roman" w:hAnsi="Times New Roman" w:cs="Times New Roman"/>
+          <w:sz w:val="28"/>
+          <w:szCs w:val="28"/>
+        </w:rPr>
+      </w:pPr>
+      <w:r>
+        <w:rPr>
+          <w:rFonts w:ascii="Times New Roman" w:hAnsi="Times New Roman" w:cs="Times New Roman"/>
+          <w:sz w:val="28"/>
+          <w:szCs w:val="28"/>
+        </w:rPr>
+        <w:t>1.</w:t>
+      </w:r>
+      <w:r>
+        <w:rPr>
+          <w:rFonts w:ascii="Times New Roman" w:hAnsi="Times New Roman" w:cs="Times New Roman"/>
+          <w:sz w:val="28"/>
+          <w:szCs w:val="28"/>
+        </w:rPr>
+        <w:t xml:space="preserve"> </w:t>
+      </w:r>
+      <w:r>
+        <w:rPr>
+          <w:rFonts w:ascii="Times New Roman" w:hAnsi="Times New Roman" w:cs="Times New Roman"/>
+          <w:b/>
+          <w:bCs/>
+          <w:sz w:val="28"/>
+          <w:szCs w:val="28"/>
+        </w:rPr>
+        <w:t>Definisi Struktur Halaman</w:t>
+      </w:r>
+      <w:r>
+        <w:rPr>
+          <w:rFonts w:ascii="Times New Roman" w:hAnsi="Times New Roman" w:cs="Times New Roman"/>
+          <w:sz w:val="28"/>
+          <w:szCs w:val="28"/>
+        </w:rPr>
+        <w:t>: File ini membuat kerangka HTML dasar, termasuk &lt;html&gt;, &lt;head&gt;, dan &lt;body&gt;.</w:t>
+      </w:r>
+    </w:p>
+    <w:p>
+      <w:pPr>
+        <w:rPr>
+          <w:rFonts w:ascii="Times New Roman" w:hAnsi="Times New Roman" w:cs="Times New Roman"/>
+          <w:sz w:val="28"/>
+          <w:szCs w:val="28"/>
+        </w:rPr>
+      </w:pPr>
+      <w:r>
+        <w:rPr>
+          <w:rFonts w:ascii="Times New Roman" w:hAnsi="Times New Roman" w:cs="Times New Roman"/>
+          <w:sz w:val="28"/>
+          <w:szCs w:val="28"/>
+        </w:rPr>
+        <w:t>2.</w:t>
+      </w:r>
+      <w:r>
+        <w:rPr>
+          <w:rFonts w:ascii="Times New Roman" w:hAnsi="Times New Roman" w:cs="Times New Roman"/>
+          <w:sz w:val="28"/>
+          <w:szCs w:val="28"/>
+        </w:rPr>
+        <w:t xml:space="preserve">  </w:t>
+      </w:r>
+      <w:r>
+        <w:rPr>
+          <w:rFonts w:ascii="Times New Roman" w:hAnsi="Times New Roman" w:cs="Times New Roman"/>
+          <w:b/>
+          <w:bCs/>
+          <w:sz w:val="28"/>
+          <w:szCs w:val="28"/>
+        </w:rPr>
+        <w:t>Penggunaan @yield</w:t>
+      </w:r>
+      <w:r>
+        <w:rPr>
+          <w:rFonts w:ascii="Times New Roman" w:hAnsi="Times New Roman" w:cs="Times New Roman"/>
+          <w:sz w:val="28"/>
+          <w:szCs w:val="28"/>
+        </w:rPr>
+        <w:t>:</w:t>
+      </w:r>
+    </w:p>
+    <w:p>
+      <w:pPr>
+        <w:numPr>
+          <w:ilvl w:val="0"/>
+          <w:numId w:val="20"/>
+        </w:numPr>
+        <w:rPr>
+          <w:rFonts w:ascii="Times New Roman" w:hAnsi="Times New Roman" w:cs="Times New Roman"/>
+          <w:sz w:val="28"/>
+          <w:szCs w:val="28"/>
+        </w:rPr>
+      </w:pPr>
+      <w:r>
+        <w:rPr>
+          <w:rFonts w:ascii="Times New Roman" w:hAnsi="Times New Roman" w:cs="Times New Roman"/>
+          <w:sz w:val="28"/>
+          <w:szCs w:val="28"/>
+        </w:rPr>
+        <w:t xml:space="preserve">@yield(section: "title"): Digunakan di &lt;head&gt; untuk </w:t>
+      </w:r>
+      <w:r>
+        <w:rPr>
+          <w:rFonts w:ascii="Times New Roman" w:hAnsi="Times New Roman" w:cs="Times New Roman"/>
+          <w:i/>
+          <w:iCs/>
+          <w:sz w:val="28"/>
+          <w:szCs w:val="28"/>
+        </w:rPr>
+        <w:t>title</w:t>
+      </w:r>
+      <w:r>
+        <w:rPr>
+          <w:rFonts w:ascii="Times New Roman" w:hAnsi="Times New Roman" w:cs="Times New Roman"/>
+          <w:sz w:val="28"/>
+          <w:szCs w:val="28"/>
+        </w:rPr>
+        <w:t xml:space="preserve"> halaman. </w:t>
+      </w:r>
+    </w:p>
+    <w:p>
+      <w:pPr>
+        <w:rPr>
+          <w:rFonts w:ascii="Times New Roman" w:hAnsi="Times New Roman" w:cs="Times New Roman"/>
+          <w:sz w:val="28"/>
+          <w:szCs w:val="28"/>
+        </w:rPr>
+      </w:pPr>
+      <w:r>
+        <w:rPr>
+          <w:rFonts w:ascii="Times New Roman" w:hAnsi="Times New Roman" w:cs="Times New Roman"/>
+          <w:sz w:val="28"/>
+          <w:szCs w:val="28"/>
+        </w:rPr>
+        <w:t>Default judulnya adalah 'App Pegawai'.</w:t>
+      </w:r>
+    </w:p>
+    <w:p>
+      <w:pPr>
+        <w:numPr>
+          <w:ilvl w:val="0"/>
+          <w:numId w:val="20"/>
+        </w:numPr>
+        <w:rPr>
+          <w:rFonts w:ascii="Times New Roman" w:hAnsi="Times New Roman" w:cs="Times New Roman"/>
+          <w:sz w:val="28"/>
+          <w:szCs w:val="28"/>
+        </w:rPr>
+      </w:pPr>
+      <w:r>
+        <w:rPr>
+          <w:rFonts w:ascii="Times New Roman" w:hAnsi="Times New Roman" w:cs="Times New Roman"/>
+          <w:sz w:val="28"/>
+          <w:szCs w:val="28"/>
+        </w:rPr>
+        <w:t>@yield(section: "content"): Digunakan di dalam &lt;main&gt; untuk menampung seluruh konten spesifik dari halaman turunan (seperti index.blade.php).</w:t>
+      </w:r>
+    </w:p>
+    <w:p>
+      <w:pPr>
+        <w:rPr>
+          <w:rFonts w:ascii="Times New Roman" w:hAnsi="Times New Roman" w:cs="Times New Roman"/>
+          <w:sz w:val="28"/>
+          <w:szCs w:val="28"/>
+        </w:rPr>
+      </w:pPr>
+      <w:r>
+        <w:rPr>
+          <w:rFonts w:ascii="Times New Roman" w:hAnsi="Times New Roman" w:cs="Times New Roman"/>
+          <w:sz w:val="28"/>
+          <w:szCs w:val="28"/>
+        </w:rPr>
+        <w:t>3.</w:t>
+      </w:r>
+      <w:r>
+        <w:rPr>
+          <w:rFonts w:ascii="Times New Roman" w:hAnsi="Times New Roman" w:cs="Times New Roman"/>
+          <w:sz w:val="28"/>
+          <w:szCs w:val="28"/>
+        </w:rPr>
+        <w:t xml:space="preserve">  </w:t>
+      </w:r>
+      <w:r>
+        <w:rPr>
+          <w:rFonts w:ascii="Times New Roman" w:hAnsi="Times New Roman" w:cs="Times New Roman"/>
+          <w:b/>
+          <w:bCs/>
+          <w:sz w:val="28"/>
+          <w:szCs w:val="28"/>
+        </w:rPr>
+        <w:t>Navigasi</w:t>
+      </w:r>
+      <w:r>
+        <w:rPr>
+          <w:rFonts w:ascii="Times New Roman" w:hAnsi="Times New Roman" w:cs="Times New Roman"/>
+          <w:sz w:val="28"/>
+          <w:szCs w:val="28"/>
+        </w:rPr>
+        <w:t>: Element &lt;nav&gt; berisi daftar tautan (</w:t>
+      </w:r>
+      <w:r>
+        <w:rPr>
+          <w:rFonts w:ascii="Times New Roman" w:hAnsi="Times New Roman" w:cs="Times New Roman"/>
+          <w:i/>
+          <w:iCs/>
+          <w:sz w:val="28"/>
+          <w:szCs w:val="28"/>
+        </w:rPr>
+        <w:t>link</w:t>
+      </w:r>
+      <w:r>
+        <w:rPr>
+          <w:rFonts w:ascii="Times New Roman" w:hAnsi="Times New Roman" w:cs="Times New Roman"/>
+          <w:sz w:val="28"/>
+          <w:szCs w:val="28"/>
+        </w:rPr>
+        <w:t xml:space="preserve">) menggunakan </w:t>
+      </w:r>
+      <w:r>
+        <w:rPr>
+          <w:rFonts w:ascii="Times New Roman" w:hAnsi="Times New Roman" w:cs="Times New Roman"/>
+          <w:i/>
+          <w:iCs/>
+          <w:sz w:val="28"/>
+          <w:szCs w:val="28"/>
+        </w:rPr>
+        <w:t>function</w:t>
+      </w:r>
+      <w:r>
+        <w:rPr>
+          <w:rFonts w:ascii="Times New Roman" w:hAnsi="Times New Roman" w:cs="Times New Roman"/>
+          <w:sz w:val="28"/>
+          <w:szCs w:val="28"/>
+        </w:rPr>
+        <w:t xml:space="preserve"> </w:t>
+      </w:r>
+      <w:r>
+        <w:rPr>
+          <w:rFonts w:ascii="Times New Roman" w:hAnsi="Times New Roman" w:cs="Times New Roman"/>
+          <w:b/>
+          <w:bCs/>
+          <w:sz w:val="28"/>
+          <w:szCs w:val="28"/>
+        </w:rPr>
+        <w:t>route()</w:t>
+      </w:r>
+      <w:r>
+        <w:rPr>
+          <w:rFonts w:ascii="Times New Roman" w:hAnsi="Times New Roman" w:cs="Times New Roman"/>
+          <w:sz w:val="28"/>
+          <w:szCs w:val="28"/>
+        </w:rPr>
+        <w:t xml:space="preserve"> yang mengarah ke berbagai modul, seperti </w:t>
+      </w:r>
+      <w:r>
+        <w:rPr>
+          <w:rFonts w:ascii="Times New Roman" w:hAnsi="Times New Roman" w:cs="Times New Roman"/>
+          <w:i/>
+          <w:iCs/>
+          <w:sz w:val="28"/>
+          <w:szCs w:val="28"/>
+        </w:rPr>
+        <w:t>Employee</w:t>
+      </w:r>
+      <w:r>
+        <w:rPr>
+          <w:rFonts w:ascii="Times New Roman" w:hAnsi="Times New Roman" w:cs="Times New Roman"/>
+          <w:sz w:val="28"/>
+          <w:szCs w:val="28"/>
+        </w:rPr>
+        <w:t xml:space="preserve">, </w:t>
+      </w:r>
+      <w:r>
+        <w:rPr>
+          <w:rFonts w:ascii="Times New Roman" w:hAnsi="Times New Roman" w:cs="Times New Roman"/>
+          <w:i/>
+          <w:iCs/>
+          <w:sz w:val="28"/>
+          <w:szCs w:val="28"/>
+        </w:rPr>
+        <w:t>Department</w:t>
+      </w:r>
+      <w:r>
+        <w:rPr>
+          <w:rFonts w:ascii="Times New Roman" w:hAnsi="Times New Roman" w:cs="Times New Roman"/>
+          <w:sz w:val="28"/>
+          <w:szCs w:val="28"/>
+        </w:rPr>
+        <w:t xml:space="preserve">, </w:t>
+      </w:r>
+      <w:r>
+        <w:rPr>
+          <w:rFonts w:ascii="Times New Roman" w:hAnsi="Times New Roman" w:cs="Times New Roman"/>
+          <w:i/>
+          <w:iCs/>
+          <w:sz w:val="28"/>
+          <w:szCs w:val="28"/>
+        </w:rPr>
+        <w:t>Attendance</w:t>
+      </w:r>
+      <w:r>
+        <w:rPr>
+          <w:rFonts w:ascii="Times New Roman" w:hAnsi="Times New Roman" w:cs="Times New Roman"/>
+          <w:sz w:val="28"/>
+          <w:szCs w:val="28"/>
+        </w:rPr>
+        <w:t xml:space="preserve">, </w:t>
+      </w:r>
+      <w:r>
+        <w:rPr>
+          <w:rFonts w:ascii="Times New Roman" w:hAnsi="Times New Roman" w:cs="Times New Roman"/>
+          <w:i/>
+          <w:iCs/>
+          <w:sz w:val="28"/>
+          <w:szCs w:val="28"/>
+        </w:rPr>
+        <w:t>Report</w:t>
+      </w:r>
+      <w:r>
+        <w:rPr>
+          <w:rFonts w:ascii="Times New Roman" w:hAnsi="Times New Roman" w:cs="Times New Roman"/>
+          <w:sz w:val="28"/>
+          <w:szCs w:val="28"/>
+        </w:rPr>
+        <w:t xml:space="preserve">, dan </w:t>
+      </w:r>
+      <w:r>
+        <w:rPr>
+          <w:rFonts w:ascii="Times New Roman" w:hAnsi="Times New Roman" w:cs="Times New Roman"/>
+          <w:i/>
+          <w:iCs/>
+          <w:sz w:val="28"/>
+          <w:szCs w:val="28"/>
+        </w:rPr>
+        <w:t>Settings</w:t>
+      </w:r>
+      <w:r>
+        <w:rPr>
+          <w:rFonts w:ascii="Times New Roman" w:hAnsi="Times New Roman" w:cs="Times New Roman"/>
+          <w:sz w:val="28"/>
+          <w:szCs w:val="28"/>
+        </w:rPr>
+        <w:t>.</w:t>
+      </w:r>
+    </w:p>
+    <w:p>
+      <w:pPr>
+        <w:rPr>
+          <w:rFonts w:ascii="Times New Roman" w:hAnsi="Times New Roman" w:cs="Times New Roman"/>
+          <w:sz w:val="28"/>
+          <w:szCs w:val="28"/>
+        </w:rPr>
+      </w:pPr>
+      <w:r>
+        <w:rPr>
+          <w:rFonts w:ascii="Times New Roman" w:hAnsi="Times New Roman" w:cs="Times New Roman"/>
+          <w:sz w:val="28"/>
+          <w:szCs w:val="28"/>
+        </w:rPr>
+        <w:t>4.</w:t>
+      </w:r>
+      <w:r>
+        <w:rPr>
+          <w:rFonts w:ascii="Times New Roman" w:hAnsi="Times New Roman" w:cs="Times New Roman"/>
+          <w:sz w:val="28"/>
+          <w:szCs w:val="28"/>
+        </w:rPr>
+        <w:t xml:space="preserve">  </w:t>
+      </w:r>
+      <w:r>
+        <w:rPr>
+          <w:rFonts w:ascii="Times New Roman" w:hAnsi="Times New Roman" w:cs="Times New Roman"/>
+          <w:b/>
+          <w:bCs/>
+          <w:sz w:val="28"/>
+          <w:szCs w:val="28"/>
+        </w:rPr>
+        <w:t>Footer</w:t>
+      </w:r>
+      <w:r>
+        <w:rPr>
+          <w:rFonts w:ascii="Times New Roman" w:hAnsi="Times New Roman" w:cs="Times New Roman"/>
+          <w:sz w:val="28"/>
+          <w:szCs w:val="28"/>
+        </w:rPr>
+        <w:t xml:space="preserve">: Menampilkan </w:t>
+      </w:r>
+      <w:r>
+        <w:rPr>
+          <w:rFonts w:ascii="Times New Roman" w:hAnsi="Times New Roman" w:cs="Times New Roman"/>
+          <w:i/>
+          <w:iCs/>
+          <w:sz w:val="28"/>
+          <w:szCs w:val="28"/>
+        </w:rPr>
+        <w:t>copyright</w:t>
+      </w:r>
+      <w:r>
+        <w:rPr>
+          <w:rFonts w:ascii="Times New Roman" w:hAnsi="Times New Roman" w:cs="Times New Roman"/>
+          <w:sz w:val="28"/>
+          <w:szCs w:val="28"/>
+        </w:rPr>
+        <w:t xml:space="preserve"> tahun saat ini ({{ date(format: "Y") }}) dan nama aplikasi "App Pegawai".</w:t>
+      </w:r>
+    </w:p>
+    <w:p>
+      <w:pPr>
+        <w:rPr>
+          <w:rFonts w:ascii="Times New Roman" w:hAnsi="Times New Roman" w:cs="Times New Roman"/>
+          <w:sz w:val="28"/>
+          <w:szCs w:val="28"/>
+        </w:rPr>
+      </w:pPr>
+    </w:p>
+    <w:p>
+      <w:pPr>
+        <w:rPr>
+          <w:rFonts w:ascii="Times New Roman" w:hAnsi="Times New Roman" w:cs="Times New Roman"/>
+          <w:sz w:val="32"/>
+          <w:szCs w:val="32"/>
+        </w:rPr>
+      </w:pPr>
+    </w:p>
+    <w:p>
+      <w:pPr>
+        <w:rPr>
+          <w:rFonts w:ascii="Times New Roman" w:hAnsi="Times New Roman" w:cs="Times New Roman"/>
+          <w:sz w:val="32"/>
+          <w:szCs w:val="32"/>
+        </w:rPr>
+      </w:pPr>
+    </w:p>
+    <w:p>
+      <w:pPr>
+        <w:rPr>
+          <w:rFonts w:ascii="Times New Roman" w:hAnsi="Times New Roman" w:cs="Times New Roman"/>
+          <w:sz w:val="32"/>
+          <w:szCs w:val="32"/>
+        </w:rPr>
+      </w:pPr>
+    </w:p>
+    <w:p>
+      <w:pPr>
+        <w:rPr>
+          <w:rFonts w:ascii="Times New Roman" w:hAnsi="Times New Roman" w:cs="Times New Roman"/>
+          <w:sz w:val="32"/>
+          <w:szCs w:val="32"/>
+        </w:rPr>
+      </w:pPr>
+    </w:p>
+    <w:p>
+      <w:pPr>
+        <w:rPr>
+          <w:rFonts w:ascii="Times New Roman" w:hAnsi="Times New Roman" w:cs="Times New Roman"/>
+          <w:sz w:val="32"/>
+          <w:szCs w:val="32"/>
+        </w:rPr>
+      </w:pPr>
+    </w:p>
+    <w:p>
+      <w:pPr>
+        <w:rPr>
+          <w:rFonts w:ascii="Times New Roman" w:hAnsi="Times New Roman" w:cs="Times New Roman"/>
+          <w:sz w:val="32"/>
+          <w:szCs w:val="32"/>
+        </w:rPr>
+      </w:pPr>
+    </w:p>
+    <w:p>
+      <w:pPr>
+        <w:rPr>
+          <w:rFonts w:ascii="Times New Roman" w:hAnsi="Times New Roman" w:cs="Times New Roman"/>
+          <w:sz w:val="32"/>
+          <w:szCs w:val="32"/>
+        </w:rPr>
+      </w:pPr>
+    </w:p>
+    <w:p>
+      <w:pPr>
+        <w:rPr>
+          <w:rFonts w:ascii="Times New Roman" w:hAnsi="Times New Roman" w:cs="Times New Roman"/>
+          <w:sz w:val="32"/>
+          <w:szCs w:val="32"/>
+        </w:rPr>
+      </w:pPr>
+    </w:p>
+    <w:p>
+      <w:pPr>
+        <w:rPr>
+          <w:rFonts w:ascii="Times New Roman" w:hAnsi="Times New Roman" w:cs="Times New Roman"/>
+          <w:sz w:val="32"/>
+          <w:szCs w:val="32"/>
+        </w:rPr>
+      </w:pPr>
+    </w:p>
+    <w:p>
+      <w:pPr>
+        <w:rPr>
+          <w:rFonts w:ascii="Times New Roman" w:hAnsi="Times New Roman" w:cs="Times New Roman"/>
+          <w:sz w:val="32"/>
+          <w:szCs w:val="32"/>
+        </w:rPr>
+      </w:pPr>
+      <w:r>
+        <w:rPr>
+          <w:rFonts w:ascii="Times New Roman" w:hAnsi="Times New Roman" w:cs="Times New Roman"/>
+          <w:sz w:val="32"/>
+          <w:szCs w:val="32"/>
+        </w:rPr>
+        <w:lastRenderedPageBreak/>
         <w:t>2.menyesuaikan tampilan halaman utama employee</w:t>
       </w:r>
       <w:r>
@@ -558,10 +2041,10 @@
       <w:r>
         <w:rPr>
           <w:rFonts w:ascii="Times New Roman" w:hAnsi="Times New Roman" w:cs="Times New Roman"/>
-          <w:sz w:val="32"/>
-          <w:szCs w:val="32"/>
-        </w:rPr>
-        <w:lastRenderedPageBreak/>
+          <w:noProof/>
+          <w:sz w:val="32"/>
+          <w:szCs w:val="32"/>
+        </w:rPr>
         <w:drawing>
           <wp:inline distT="0" distB="0" distL="0" distR="0" wp14:anchorId="4570C344" wp14:editId="717D143A">
             <wp:extent cx="5943600" cy="4705350"/>
@@ -607,6 +2090,15 @@
           <w:szCs w:val="32"/>
         </w:rPr>
       </w:pPr>
+    </w:p>
+    <w:p>
+      <w:pPr>
+        <w:rPr>
+          <w:rFonts w:ascii="Times New Roman" w:hAnsi="Times New Roman" w:cs="Times New Roman"/>
+          <w:sz w:val="32"/>
+          <w:szCs w:val="32"/>
+        </w:rPr>
+      </w:pPr>
       <w:r>
         <w:rPr>
           <w:rFonts w:ascii="Times New Roman" w:hAnsi="Times New Roman" w:cs="Times New Roman"/>
@@ -620,32 +2112,765 @@
       <w:pPr>
         <w:rPr>
           <w:rFonts w:ascii="Times New Roman" w:hAnsi="Times New Roman" w:cs="Times New Roman"/>
-          <w:b/>
-          <w:bCs/>
-          <w:sz w:val="32"/>
-          <w:szCs w:val="32"/>
-        </w:rPr>
-      </w:pPr>
-      <w:r>
-        <w:rPr>
-          <w:rFonts w:ascii="Times New Roman" w:hAnsi="Times New Roman" w:cs="Times New Roman"/>
-          <w:b/>
-          <w:bCs/>
-          <w:sz w:val="32"/>
-          <w:szCs w:val="32"/>
-        </w:rPr>
-        <w:t>D</w:t>
-      </w:r>
-      <w:r>
-        <w:rPr>
-          <w:rFonts w:ascii="Times New Roman" w:hAnsi="Times New Roman" w:cs="Times New Roman"/>
-          <w:b/>
-          <w:bCs/>
-          <w:sz w:val="32"/>
-          <w:szCs w:val="32"/>
+          <w:sz w:val="28"/>
+          <w:szCs w:val="28"/>
+        </w:rPr>
+      </w:pPr>
+      <w:r>
+        <w:rPr>
+          <w:rFonts w:ascii="Times New Roman" w:hAnsi="Times New Roman" w:cs="Times New Roman"/>
+          <w:b/>
+          <w:bCs/>
+          <w:sz w:val="28"/>
+          <w:szCs w:val="28"/>
+        </w:rPr>
+        <w:t>index.blade.php</w:t>
+      </w:r>
+      <w:r>
+        <w:rPr>
+          <w:rFonts w:ascii="Times New Roman" w:hAnsi="Times New Roman" w:cs="Times New Roman"/>
+          <w:sz w:val="28"/>
+          <w:szCs w:val="28"/>
+        </w:rPr>
+        <w:t xml:space="preserve"> adalah </w:t>
+      </w:r>
+      <w:r>
+        <w:rPr>
+          <w:rFonts w:ascii="Times New Roman" w:hAnsi="Times New Roman" w:cs="Times New Roman"/>
+          <w:i/>
+          <w:iCs/>
+          <w:sz w:val="28"/>
+          <w:szCs w:val="28"/>
+        </w:rPr>
+        <w:t>view</w:t>
+      </w:r>
+      <w:r>
+        <w:rPr>
+          <w:rFonts w:ascii="Times New Roman" w:hAnsi="Times New Roman" w:cs="Times New Roman"/>
+          <w:sz w:val="28"/>
+          <w:szCs w:val="28"/>
+        </w:rPr>
+        <w:t xml:space="preserve"> yang bertanggung jawab menampilkan </w:t>
+      </w:r>
+      <w:r>
+        <w:rPr>
+          <w:rFonts w:ascii="Times New Roman" w:hAnsi="Times New Roman" w:cs="Times New Roman"/>
+          <w:b/>
+          <w:bCs/>
+          <w:sz w:val="28"/>
+          <w:szCs w:val="28"/>
+        </w:rPr>
+        <w:t>daftar data pegawai</w:t>
+      </w:r>
+      <w:r>
+        <w:rPr>
+          <w:rFonts w:ascii="Times New Roman" w:hAnsi="Times New Roman" w:cs="Times New Roman"/>
+          <w:sz w:val="28"/>
+          <w:szCs w:val="28"/>
+        </w:rPr>
+        <w:t xml:space="preserve"> dan mengimplementasikan operasi </w:t>
+      </w:r>
+      <w:r>
+        <w:rPr>
+          <w:rFonts w:ascii="Times New Roman" w:hAnsi="Times New Roman" w:cs="Times New Roman"/>
+          <w:b/>
+          <w:bCs/>
+          <w:sz w:val="28"/>
+          <w:szCs w:val="28"/>
+        </w:rPr>
+        <w:t>Read</w:t>
+      </w:r>
+      <w:r>
+        <w:rPr>
+          <w:rFonts w:ascii="Times New Roman" w:hAnsi="Times New Roman" w:cs="Times New Roman"/>
+          <w:sz w:val="28"/>
+          <w:szCs w:val="28"/>
+        </w:rPr>
+        <w:t xml:space="preserve"> dari CRUD.</w:t>
+      </w:r>
+    </w:p>
+    <w:p>
+      <w:pPr>
+        <w:rPr>
+          <w:rFonts w:ascii="Times New Roman" w:hAnsi="Times New Roman" w:cs="Times New Roman"/>
+          <w:sz w:val="28"/>
+          <w:szCs w:val="28"/>
+        </w:rPr>
+      </w:pPr>
+      <w:r>
+        <w:rPr>
+          <w:rFonts w:ascii="Times New Roman" w:hAnsi="Times New Roman" w:cs="Times New Roman"/>
+          <w:sz w:val="28"/>
+          <w:szCs w:val="28"/>
+        </w:rPr>
+        <w:t>1.</w:t>
+      </w:r>
+      <w:r>
+        <w:rPr>
+          <w:rFonts w:ascii="Times New Roman" w:hAnsi="Times New Roman" w:cs="Times New Roman"/>
+          <w:sz w:val="28"/>
+          <w:szCs w:val="28"/>
+        </w:rPr>
+        <w:t xml:space="preserve">  </w:t>
+      </w:r>
+      <w:r>
+        <w:rPr>
+          <w:rFonts w:ascii="Times New Roman" w:hAnsi="Times New Roman" w:cs="Times New Roman"/>
+          <w:b/>
+          <w:bCs/>
+          <w:sz w:val="28"/>
+          <w:szCs w:val="28"/>
+        </w:rPr>
+        <w:t>Mewarisi Layout</w:t>
+      </w:r>
+      <w:r>
+        <w:rPr>
+          <w:rFonts w:ascii="Times New Roman" w:hAnsi="Times New Roman" w:cs="Times New Roman"/>
+          <w:sz w:val="28"/>
+          <w:szCs w:val="28"/>
+        </w:rPr>
+        <w:t xml:space="preserve">: Menggunakan </w:t>
+      </w:r>
+      <w:r>
+        <w:rPr>
+          <w:rFonts w:ascii="Times New Roman" w:hAnsi="Times New Roman" w:cs="Times New Roman"/>
+          <w:b/>
+          <w:bCs/>
+          <w:sz w:val="28"/>
+          <w:szCs w:val="28"/>
+        </w:rPr>
+        <w:t>@extends('view: "employees.master")</w:t>
+      </w:r>
+      <w:r>
+        <w:rPr>
+          <w:rFonts w:ascii="Times New Roman" w:hAnsi="Times New Roman" w:cs="Times New Roman"/>
+          <w:sz w:val="28"/>
+          <w:szCs w:val="28"/>
+        </w:rPr>
+        <w:t xml:space="preserve"> untuk mewarisi struktur dari master.blade.php.</w:t>
+      </w:r>
+    </w:p>
+    <w:p>
+      <w:pPr>
+        <w:rPr>
+          <w:rFonts w:ascii="Times New Roman" w:hAnsi="Times New Roman" w:cs="Times New Roman"/>
+          <w:sz w:val="28"/>
+          <w:szCs w:val="28"/>
+        </w:rPr>
+      </w:pPr>
+      <w:r>
+        <w:rPr>
+          <w:rFonts w:ascii="Times New Roman" w:hAnsi="Times New Roman" w:cs="Times New Roman"/>
+          <w:sz w:val="28"/>
+          <w:szCs w:val="28"/>
+        </w:rPr>
+        <w:t>2.</w:t>
+      </w:r>
+      <w:r>
+        <w:rPr>
+          <w:rFonts w:ascii="Times New Roman" w:hAnsi="Times New Roman" w:cs="Times New Roman"/>
+          <w:sz w:val="28"/>
+          <w:szCs w:val="28"/>
+        </w:rPr>
+        <w:t xml:space="preserve">  </w:t>
+      </w:r>
+      <w:r>
+        <w:rPr>
+          <w:rFonts w:ascii="Times New Roman" w:hAnsi="Times New Roman" w:cs="Times New Roman"/>
+          <w:b/>
+          <w:bCs/>
+          <w:sz w:val="28"/>
+          <w:szCs w:val="28"/>
+        </w:rPr>
+        <w:t>Mengisi Konten</w:t>
+      </w:r>
+      <w:r>
+        <w:rPr>
+          <w:rFonts w:ascii="Times New Roman" w:hAnsi="Times New Roman" w:cs="Times New Roman"/>
+          <w:sz w:val="28"/>
+          <w:szCs w:val="28"/>
+        </w:rPr>
+        <w:t xml:space="preserve">: Menggunakan </w:t>
+      </w:r>
+      <w:r>
+        <w:rPr>
+          <w:rFonts w:ascii="Times New Roman" w:hAnsi="Times New Roman" w:cs="Times New Roman"/>
+          <w:b/>
+          <w:bCs/>
+          <w:sz w:val="28"/>
+          <w:szCs w:val="28"/>
+        </w:rPr>
+        <w:t>@section('section: "content")</w:t>
+      </w:r>
+      <w:r>
+        <w:rPr>
+          <w:rFonts w:ascii="Times New Roman" w:hAnsi="Times New Roman" w:cs="Times New Roman"/>
+          <w:sz w:val="28"/>
+          <w:szCs w:val="28"/>
+        </w:rPr>
+        <w:t xml:space="preserve"> untuk mengisi area @yield("content") pada </w:t>
+      </w:r>
+      <w:r>
+        <w:rPr>
+          <w:rFonts w:ascii="Times New Roman" w:hAnsi="Times New Roman" w:cs="Times New Roman"/>
+          <w:i/>
+          <w:iCs/>
+          <w:sz w:val="28"/>
+          <w:szCs w:val="28"/>
+        </w:rPr>
+        <w:t>master layout</w:t>
+      </w:r>
+      <w:r>
+        <w:rPr>
+          <w:rFonts w:ascii="Times New Roman" w:hAnsi="Times New Roman" w:cs="Times New Roman"/>
+          <w:sz w:val="28"/>
+          <w:szCs w:val="28"/>
         </w:rPr>
         <w:t>.</w:t>
       </w:r>
+    </w:p>
+    <w:p>
+      <w:pPr>
+        <w:rPr>
+          <w:rFonts w:ascii="Times New Roman" w:hAnsi="Times New Roman" w:cs="Times New Roman"/>
+          <w:sz w:val="28"/>
+          <w:szCs w:val="28"/>
+        </w:rPr>
+      </w:pPr>
+      <w:r>
+        <w:rPr>
+          <w:rFonts w:ascii="Times New Roman" w:hAnsi="Times New Roman" w:cs="Times New Roman"/>
+          <w:sz w:val="28"/>
+          <w:szCs w:val="28"/>
+        </w:rPr>
+        <w:t>3.</w:t>
+      </w:r>
+      <w:r>
+        <w:rPr>
+          <w:rFonts w:ascii="Times New Roman" w:hAnsi="Times New Roman" w:cs="Times New Roman"/>
+          <w:sz w:val="28"/>
+          <w:szCs w:val="28"/>
+        </w:rPr>
+        <w:t xml:space="preserve">  </w:t>
+      </w:r>
+      <w:r>
+        <w:rPr>
+          <w:rFonts w:ascii="Times New Roman" w:hAnsi="Times New Roman" w:cs="Times New Roman"/>
+          <w:b/>
+          <w:bCs/>
+          <w:sz w:val="28"/>
+          <w:szCs w:val="28"/>
+        </w:rPr>
+        <w:t>Menampilkan Data</w:t>
+      </w:r>
+      <w:r>
+        <w:rPr>
+          <w:rFonts w:ascii="Times New Roman" w:hAnsi="Times New Roman" w:cs="Times New Roman"/>
+          <w:sz w:val="28"/>
+          <w:szCs w:val="28"/>
+        </w:rPr>
+        <w:t>: Data ditampilkan dalam sebuah tabel.</w:t>
+      </w:r>
+    </w:p>
+    <w:p>
+      <w:pPr>
+        <w:numPr>
+          <w:ilvl w:val="0"/>
+          <w:numId w:val="21"/>
+        </w:numPr>
+        <w:rPr>
+          <w:rFonts w:ascii="Times New Roman" w:hAnsi="Times New Roman" w:cs="Times New Roman"/>
+          <w:sz w:val="28"/>
+          <w:szCs w:val="28"/>
+        </w:rPr>
+      </w:pPr>
+      <w:r>
+        <w:rPr>
+          <w:rFonts w:ascii="Times New Roman" w:hAnsi="Times New Roman" w:cs="Times New Roman"/>
+          <w:sz w:val="28"/>
+          <w:szCs w:val="28"/>
+        </w:rPr>
+        <w:lastRenderedPageBreak/>
+        <w:t xml:space="preserve">Digunakan perulangan </w:t>
+      </w:r>
+    </w:p>
+    <w:p>
+      <w:pPr>
+        <w:rPr>
+          <w:rFonts w:ascii="Times New Roman" w:hAnsi="Times New Roman" w:cs="Times New Roman"/>
+          <w:sz w:val="28"/>
+          <w:szCs w:val="28"/>
+        </w:rPr>
+      </w:pPr>
+      <w:r>
+        <w:rPr>
+          <w:rFonts w:ascii="Times New Roman" w:hAnsi="Times New Roman" w:cs="Times New Roman"/>
+          <w:b/>
+          <w:bCs/>
+          <w:sz w:val="28"/>
+          <w:szCs w:val="28"/>
+        </w:rPr>
+        <w:t>@foreach ($employees as $employee)</w:t>
+      </w:r>
+      <w:r>
+        <w:rPr>
+          <w:rFonts w:ascii="Times New Roman" w:hAnsi="Times New Roman" w:cs="Times New Roman"/>
+          <w:sz w:val="28"/>
+          <w:szCs w:val="28"/>
+        </w:rPr>
+        <w:t xml:space="preserve"> untuk mengambil dan menampilkan setiap data pegawai ($employee) ke dalam baris tabel (&lt;tr&gt;).</w:t>
+      </w:r>
+    </w:p>
+    <w:p>
+      <w:pPr>
+        <w:rPr>
+          <w:rFonts w:ascii="Times New Roman" w:hAnsi="Times New Roman" w:cs="Times New Roman"/>
+          <w:sz w:val="28"/>
+          <w:szCs w:val="28"/>
+        </w:rPr>
+      </w:pPr>
+      <w:r>
+        <w:rPr>
+          <w:rFonts w:ascii="Times New Roman" w:hAnsi="Times New Roman" w:cs="Times New Roman"/>
+          <w:sz w:val="28"/>
+          <w:szCs w:val="28"/>
+        </w:rPr>
+        <w:t>4.</w:t>
+      </w:r>
+      <w:r>
+        <w:rPr>
+          <w:rFonts w:ascii="Times New Roman" w:hAnsi="Times New Roman" w:cs="Times New Roman"/>
+          <w:sz w:val="28"/>
+          <w:szCs w:val="28"/>
+        </w:rPr>
+        <w:t xml:space="preserve">  </w:t>
+      </w:r>
+      <w:r>
+        <w:rPr>
+          <w:rFonts w:ascii="Times New Roman" w:hAnsi="Times New Roman" w:cs="Times New Roman"/>
+          <w:b/>
+          <w:bCs/>
+          <w:sz w:val="28"/>
+          <w:szCs w:val="28"/>
+        </w:rPr>
+        <w:t>Aksi (CRUD)</w:t>
+      </w:r>
+      <w:r>
+        <w:rPr>
+          <w:rFonts w:ascii="Times New Roman" w:hAnsi="Times New Roman" w:cs="Times New Roman"/>
+          <w:sz w:val="28"/>
+          <w:szCs w:val="28"/>
+        </w:rPr>
+        <w:t xml:space="preserve">: Kolom </w:t>
+      </w:r>
+      <w:r>
+        <w:rPr>
+          <w:rFonts w:ascii="Times New Roman" w:hAnsi="Times New Roman" w:cs="Times New Roman"/>
+          <w:b/>
+          <w:bCs/>
+          <w:sz w:val="28"/>
+          <w:szCs w:val="28"/>
+        </w:rPr>
+        <w:t>Aksi</w:t>
+      </w:r>
+      <w:r>
+        <w:rPr>
+          <w:rFonts w:ascii="Times New Roman" w:hAnsi="Times New Roman" w:cs="Times New Roman"/>
+          <w:sz w:val="28"/>
+          <w:szCs w:val="28"/>
+        </w:rPr>
+        <w:t xml:space="preserve"> menyediakan fungsionalitas:</w:t>
+      </w:r>
+    </w:p>
+    <w:p>
+      <w:pPr>
+        <w:numPr>
+          <w:ilvl w:val="0"/>
+          <w:numId w:val="22"/>
+        </w:numPr>
+        <w:rPr>
+          <w:rFonts w:ascii="Times New Roman" w:hAnsi="Times New Roman" w:cs="Times New Roman"/>
+          <w:sz w:val="28"/>
+          <w:szCs w:val="28"/>
+        </w:rPr>
+      </w:pPr>
+      <w:r>
+        <w:rPr>
+          <w:rFonts w:ascii="Times New Roman" w:hAnsi="Times New Roman" w:cs="Times New Roman"/>
+          <w:b/>
+          <w:bCs/>
+          <w:sz w:val="28"/>
+          <w:szCs w:val="28"/>
+        </w:rPr>
+        <w:t>Detail</w:t>
+      </w:r>
+      <w:r>
+        <w:rPr>
+          <w:rFonts w:ascii="Times New Roman" w:hAnsi="Times New Roman" w:cs="Times New Roman"/>
+          <w:sz w:val="28"/>
+          <w:szCs w:val="28"/>
+        </w:rPr>
+        <w:t xml:space="preserve">: Tautan ke </w:t>
+      </w:r>
+      <w:r>
+        <w:rPr>
+          <w:rFonts w:ascii="Times New Roman" w:hAnsi="Times New Roman" w:cs="Times New Roman"/>
+          <w:i/>
+          <w:iCs/>
+          <w:sz w:val="28"/>
+          <w:szCs w:val="28"/>
+        </w:rPr>
+        <w:t>route</w:t>
+      </w:r>
+      <w:r>
+        <w:rPr>
+          <w:rFonts w:ascii="Times New Roman" w:hAnsi="Times New Roman" w:cs="Times New Roman"/>
+          <w:sz w:val="28"/>
+          <w:szCs w:val="28"/>
+        </w:rPr>
+        <w:t xml:space="preserve"> employees.show untuk operasi </w:t>
+      </w:r>
+      <w:r>
+        <w:rPr>
+          <w:rFonts w:ascii="Times New Roman" w:hAnsi="Times New Roman" w:cs="Times New Roman"/>
+          <w:b/>
+          <w:bCs/>
+          <w:sz w:val="28"/>
+          <w:szCs w:val="28"/>
+        </w:rPr>
+        <w:t>Read</w:t>
+      </w:r>
+      <w:r>
+        <w:rPr>
+          <w:rFonts w:ascii="Times New Roman" w:hAnsi="Times New Roman" w:cs="Times New Roman"/>
+          <w:sz w:val="28"/>
+          <w:szCs w:val="28"/>
+        </w:rPr>
+        <w:t xml:space="preserve"> data tunggal.</w:t>
+      </w:r>
+    </w:p>
+    <w:p>
+      <w:pPr>
+        <w:numPr>
+          <w:ilvl w:val="0"/>
+          <w:numId w:val="22"/>
+        </w:numPr>
+        <w:rPr>
+          <w:rFonts w:ascii="Times New Roman" w:hAnsi="Times New Roman" w:cs="Times New Roman"/>
+          <w:sz w:val="28"/>
+          <w:szCs w:val="28"/>
+        </w:rPr>
+      </w:pPr>
+      <w:r>
+        <w:rPr>
+          <w:rFonts w:ascii="Times New Roman" w:hAnsi="Times New Roman" w:cs="Times New Roman"/>
+          <w:b/>
+          <w:bCs/>
+          <w:sz w:val="28"/>
+          <w:szCs w:val="28"/>
+        </w:rPr>
+        <w:t>Edit</w:t>
+      </w:r>
+      <w:r>
+        <w:rPr>
+          <w:rFonts w:ascii="Times New Roman" w:hAnsi="Times New Roman" w:cs="Times New Roman"/>
+          <w:sz w:val="28"/>
+          <w:szCs w:val="28"/>
+        </w:rPr>
+        <w:t xml:space="preserve">: Tautan ke </w:t>
+      </w:r>
+      <w:r>
+        <w:rPr>
+          <w:rFonts w:ascii="Times New Roman" w:hAnsi="Times New Roman" w:cs="Times New Roman"/>
+          <w:i/>
+          <w:iCs/>
+          <w:sz w:val="28"/>
+          <w:szCs w:val="28"/>
+        </w:rPr>
+        <w:t>route</w:t>
+      </w:r>
+      <w:r>
+        <w:rPr>
+          <w:rFonts w:ascii="Times New Roman" w:hAnsi="Times New Roman" w:cs="Times New Roman"/>
+          <w:sz w:val="28"/>
+          <w:szCs w:val="28"/>
+        </w:rPr>
+        <w:t xml:space="preserve"> employees.edit untuk operasi </w:t>
+      </w:r>
+      <w:r>
+        <w:rPr>
+          <w:rFonts w:ascii="Times New Roman" w:hAnsi="Times New Roman" w:cs="Times New Roman"/>
+          <w:b/>
+          <w:bCs/>
+          <w:sz w:val="28"/>
+          <w:szCs w:val="28"/>
+        </w:rPr>
+        <w:t>Update</w:t>
+      </w:r>
+      <w:r>
+        <w:rPr>
+          <w:rFonts w:ascii="Times New Roman" w:hAnsi="Times New Roman" w:cs="Times New Roman"/>
+          <w:sz w:val="28"/>
+          <w:szCs w:val="28"/>
+        </w:rPr>
+        <w:t>.</w:t>
+      </w:r>
+    </w:p>
+    <w:p>
+      <w:pPr>
+        <w:numPr>
+          <w:ilvl w:val="0"/>
+          <w:numId w:val="22"/>
+        </w:numPr>
+        <w:rPr>
+          <w:rFonts w:ascii="Times New Roman" w:hAnsi="Times New Roman" w:cs="Times New Roman"/>
+          <w:sz w:val="28"/>
+          <w:szCs w:val="28"/>
+        </w:rPr>
+      </w:pPr>
+      <w:r>
+        <w:rPr>
+          <w:rFonts w:ascii="Times New Roman" w:hAnsi="Times New Roman" w:cs="Times New Roman"/>
+          <w:b/>
+          <w:bCs/>
+          <w:sz w:val="28"/>
+          <w:szCs w:val="28"/>
+        </w:rPr>
+        <w:t>Delete</w:t>
+      </w:r>
+      <w:r>
+        <w:rPr>
+          <w:rFonts w:ascii="Times New Roman" w:hAnsi="Times New Roman" w:cs="Times New Roman"/>
+          <w:sz w:val="28"/>
+          <w:szCs w:val="28"/>
+        </w:rPr>
+        <w:t xml:space="preserve">: Menggunakan elemen &lt;form&gt; dengan </w:t>
+      </w:r>
+      <w:r>
+        <w:rPr>
+          <w:rFonts w:ascii="Times New Roman" w:hAnsi="Times New Roman" w:cs="Times New Roman"/>
+          <w:b/>
+          <w:bCs/>
+          <w:sz w:val="28"/>
+          <w:szCs w:val="28"/>
+        </w:rPr>
+        <w:t>@method('DELETE')</w:t>
+      </w:r>
+      <w:r>
+        <w:rPr>
+          <w:rFonts w:ascii="Times New Roman" w:hAnsi="Times New Roman" w:cs="Times New Roman"/>
+          <w:sz w:val="28"/>
+          <w:szCs w:val="28"/>
+        </w:rPr>
+        <w:t xml:space="preserve"> untuk melakukan operasi </w:t>
+      </w:r>
+      <w:r>
+        <w:rPr>
+          <w:rFonts w:ascii="Times New Roman" w:hAnsi="Times New Roman" w:cs="Times New Roman"/>
+          <w:b/>
+          <w:bCs/>
+          <w:sz w:val="28"/>
+          <w:szCs w:val="28"/>
+        </w:rPr>
+        <w:t>Delete</w:t>
+      </w:r>
+      <w:r>
+        <w:rPr>
+          <w:rFonts w:ascii="Times New Roman" w:hAnsi="Times New Roman" w:cs="Times New Roman"/>
+          <w:sz w:val="28"/>
+          <w:szCs w:val="28"/>
+        </w:rPr>
+        <w:t>. Tombol ini akan memunculkan konfirmasi "Yakin ingin menghapus?" sebelum eksekusi.</w:t>
+      </w:r>
+    </w:p>
+    <w:p>
+      <w:pPr>
+        <w:rPr>
+          <w:rFonts w:ascii="Times New Roman" w:hAnsi="Times New Roman" w:cs="Times New Roman"/>
+          <w:sz w:val="32"/>
+          <w:szCs w:val="32"/>
+        </w:rPr>
+      </w:pPr>
+      <w:r>
+        <w:rPr>
+          <w:rFonts w:ascii="Times New Roman" w:hAnsi="Times New Roman" w:cs="Times New Roman"/>
+          <w:sz w:val="32"/>
+          <w:szCs w:val="32"/>
+        </w:rPr>
+        <w:t>Output:</w:t>
+      </w:r>
+    </w:p>
+    <w:p>
+      <w:pPr>
+        <w:rPr>
+          <w:rFonts w:ascii="Times New Roman" w:hAnsi="Times New Roman" w:cs="Times New Roman"/>
+          <w:sz w:val="32"/>
+          <w:szCs w:val="32"/>
+        </w:rPr>
+      </w:pPr>
+      <w:r>
+        <w:rPr>
+          <w:rFonts w:ascii="Times New Roman" w:hAnsi="Times New Roman" w:cs="Times New Roman"/>
+          <w:noProof/>
+          <w:sz w:val="32"/>
+          <w:szCs w:val="32"/>
+        </w:rPr>
+        <w:drawing>
+          <wp:inline distT="0" distB="0" distL="0" distR="0" wp14:anchorId="256BC9CD" wp14:editId="16E37BEF">
+            <wp:extent cx="5943600" cy="2264410"/>
+            <wp:effectExtent l="0" t="0" r="0" b="2540"/>
+            <wp:docPr id="2133486634" name="Picture 1"/>
+            <wp:cNvGraphicFramePr>
+              <a:graphicFrameLocks xmlns:a="http://schemas.openxmlformats.org/drawingml/2006/main" noChangeAspect="1"/>
+            </wp:cNvGraphicFramePr>
+            <a:graphic xmlns:a="http://schemas.openxmlformats.org/drawingml/2006/main">
+              <a:graphicData uri="http://schemas.openxmlformats.org/drawingml/2006/picture">
+                <pic:pic xmlns:pic="http://schemas.openxmlformats.org/drawingml/2006/picture">
+                  <pic:nvPicPr>
+                    <pic:cNvPr id="2133486634" name=""/>
+                    <pic:cNvPicPr/>
+                  </pic:nvPicPr>
+                  <pic:blipFill>
+                    <a:blip r:embed="rId9"/>
+                    <a:stretch>
+                      <a:fillRect/>
+                    </a:stretch>
+                  </pic:blipFill>
+                  <pic:spPr>
+                    <a:xfrm>
+                      <a:off x="0" y="0"/>
+                      <a:ext cx="5943600" cy="2264410"/>
+                    </a:xfrm>
+                    <a:prstGeom prst="rect">
+                      <a:avLst/>
+                    </a:prstGeom>
+                  </pic:spPr>
+                </pic:pic>
+              </a:graphicData>
+            </a:graphic>
+          </wp:inline>
+        </w:drawing>
+      </w:r>
+    </w:p>
+    <w:p>
+      <w:pPr>
+        <w:rPr>
+          <w:rFonts w:ascii="Times New Roman" w:hAnsi="Times New Roman" w:cs="Times New Roman"/>
+          <w:b/>
+          <w:bCs/>
+          <w:sz w:val="32"/>
+          <w:szCs w:val="32"/>
+        </w:rPr>
+      </w:pPr>
+    </w:p>
+    <w:p>
+      <w:pPr>
+        <w:rPr>
+          <w:rFonts w:ascii="Times New Roman" w:hAnsi="Times New Roman" w:cs="Times New Roman"/>
+          <w:b/>
+          <w:bCs/>
+          <w:sz w:val="32"/>
+          <w:szCs w:val="32"/>
+        </w:rPr>
+      </w:pPr>
+    </w:p>
+    <w:p>
+      <w:pPr>
+        <w:rPr>
+          <w:rFonts w:ascii="Times New Roman" w:hAnsi="Times New Roman" w:cs="Times New Roman"/>
+          <w:b/>
+          <w:bCs/>
+          <w:sz w:val="32"/>
+          <w:szCs w:val="32"/>
+        </w:rPr>
+      </w:pPr>
+    </w:p>
+    <w:p>
+      <w:pPr>
+        <w:rPr>
+          <w:rFonts w:ascii="Times New Roman" w:hAnsi="Times New Roman" w:cs="Times New Roman"/>
+          <w:b/>
+          <w:bCs/>
+          <w:sz w:val="32"/>
+          <w:szCs w:val="32"/>
+        </w:rPr>
+      </w:pPr>
+    </w:p>
+    <w:p>
+      <w:pPr>
+        <w:rPr>
+          <w:rFonts w:ascii="Times New Roman" w:hAnsi="Times New Roman" w:cs="Times New Roman"/>
+          <w:b/>
+          <w:bCs/>
+          <w:sz w:val="32"/>
+          <w:szCs w:val="32"/>
+        </w:rPr>
+      </w:pPr>
+    </w:p>
+    <w:p>
+      <w:pPr>
+        <w:rPr>
+          <w:rFonts w:ascii="Times New Roman" w:hAnsi="Times New Roman" w:cs="Times New Roman"/>
+          <w:b/>
+          <w:bCs/>
+          <w:sz w:val="32"/>
+          <w:szCs w:val="32"/>
+        </w:rPr>
+      </w:pPr>
+    </w:p>
+    <w:p>
+      <w:pPr>
+        <w:rPr>
+          <w:rFonts w:ascii="Times New Roman" w:hAnsi="Times New Roman" w:cs="Times New Roman"/>
+          <w:b/>
+          <w:bCs/>
+          <w:sz w:val="32"/>
+          <w:szCs w:val="32"/>
+        </w:rPr>
+      </w:pPr>
+    </w:p>
+    <w:p>
+      <w:pPr>
+        <w:rPr>
+          <w:rFonts w:ascii="Times New Roman" w:hAnsi="Times New Roman" w:cs="Times New Roman"/>
+          <w:b/>
+          <w:bCs/>
+          <w:sz w:val="32"/>
+          <w:szCs w:val="32"/>
+        </w:rPr>
+      </w:pPr>
+    </w:p>
+    <w:p>
+      <w:pPr>
+        <w:rPr>
+          <w:rFonts w:ascii="Times New Roman" w:hAnsi="Times New Roman" w:cs="Times New Roman"/>
+          <w:b/>
+          <w:bCs/>
+          <w:sz w:val="32"/>
+          <w:szCs w:val="32"/>
+        </w:rPr>
+      </w:pPr>
+      <w:r>
+        <w:rPr>
+          <w:rFonts w:ascii="Times New Roman" w:hAnsi="Times New Roman" w:cs="Times New Roman"/>
+          <w:b/>
+          <w:bCs/>
+          <w:sz w:val="32"/>
+          <w:szCs w:val="32"/>
+        </w:rPr>
+        <w:lastRenderedPageBreak/>
+        <w:t>E</w:t>
+      </w:r>
+      <w:r>
+        <w:rPr>
+          <w:rFonts w:ascii="Times New Roman" w:hAnsi="Times New Roman" w:cs="Times New Roman"/>
+          <w:b/>
+          <w:bCs/>
+          <w:sz w:val="32"/>
+          <w:szCs w:val="32"/>
+        </w:rPr>
+        <w:t>.</w:t>
+      </w:r>
       <w:r>
         <w:rPr>
           <w:rFonts w:ascii="Times New Roman" w:hAnsi="Times New Roman" w:cs="Times New Roman"/>
@@ -661,21 +2886,517 @@
       <w:pPr>
         <w:rPr>
           <w:rFonts w:ascii="Times New Roman" w:hAnsi="Times New Roman" w:cs="Times New Roman"/>
-          <w:b/>
-          <w:bCs/>
-          <w:sz w:val="32"/>
-          <w:szCs w:val="32"/>
-        </w:rPr>
-      </w:pPr>
-      <w:r>
-        <w:rPr>
-          <w:rFonts w:ascii="Times New Roman" w:hAnsi="Times New Roman" w:cs="Times New Roman"/>
-          <w:b/>
-          <w:bCs/>
-          <w:sz w:val="32"/>
-          <w:szCs w:val="32"/>
-        </w:rPr>
-        <w:t>E.</w:t>
+          <w:sz w:val="28"/>
+          <w:szCs w:val="28"/>
+        </w:rPr>
+      </w:pPr>
+      <w:r>
+        <w:rPr>
+          <w:rFonts w:ascii="Times New Roman" w:hAnsi="Times New Roman" w:cs="Times New Roman"/>
+          <w:sz w:val="28"/>
+          <w:szCs w:val="28"/>
+        </w:rPr>
+        <w:t>1.</w:t>
+      </w:r>
+      <w:r>
+        <w:rPr>
+          <w:rFonts w:ascii="Times New Roman" w:hAnsi="Times New Roman" w:cs="Times New Roman"/>
+          <w:sz w:val="28"/>
+          <w:szCs w:val="28"/>
+        </w:rPr>
+        <w:t xml:space="preserve">  </w:t>
+      </w:r>
+      <w:r>
+        <w:rPr>
+          <w:rFonts w:ascii="Times New Roman" w:hAnsi="Times New Roman" w:cs="Times New Roman"/>
+          <w:b/>
+          <w:bCs/>
+          <w:sz w:val="28"/>
+          <w:szCs w:val="28"/>
+        </w:rPr>
+        <w:t>Penerapan MVC dan Blade</w:t>
+      </w:r>
+      <w:r>
+        <w:rPr>
+          <w:rFonts w:ascii="Times New Roman" w:hAnsi="Times New Roman" w:cs="Times New Roman"/>
+          <w:sz w:val="28"/>
+          <w:szCs w:val="28"/>
+        </w:rPr>
+        <w:t xml:space="preserve">: Implementasi ini berhasil memisahkan </w:t>
+      </w:r>
+      <w:r>
+        <w:rPr>
+          <w:rFonts w:ascii="Times New Roman" w:hAnsi="Times New Roman" w:cs="Times New Roman"/>
+          <w:i/>
+          <w:iCs/>
+          <w:sz w:val="28"/>
+          <w:szCs w:val="28"/>
+        </w:rPr>
+        <w:t>logic</w:t>
+      </w:r>
+      <w:r>
+        <w:rPr>
+          <w:rFonts w:ascii="Times New Roman" w:hAnsi="Times New Roman" w:cs="Times New Roman"/>
+          <w:sz w:val="28"/>
+          <w:szCs w:val="28"/>
+        </w:rPr>
+        <w:t xml:space="preserve"> tampilan (</w:t>
+      </w:r>
+      <w:r>
+        <w:rPr>
+          <w:rFonts w:ascii="Times New Roman" w:hAnsi="Times New Roman" w:cs="Times New Roman"/>
+          <w:i/>
+          <w:iCs/>
+          <w:sz w:val="28"/>
+          <w:szCs w:val="28"/>
+        </w:rPr>
+        <w:t>View</w:t>
+      </w:r>
+      <w:r>
+        <w:rPr>
+          <w:rFonts w:ascii="Times New Roman" w:hAnsi="Times New Roman" w:cs="Times New Roman"/>
+          <w:sz w:val="28"/>
+          <w:szCs w:val="28"/>
+        </w:rPr>
+        <w:t xml:space="preserve">) dari </w:t>
+      </w:r>
+      <w:r>
+        <w:rPr>
+          <w:rFonts w:ascii="Times New Roman" w:hAnsi="Times New Roman" w:cs="Times New Roman"/>
+          <w:i/>
+          <w:iCs/>
+          <w:sz w:val="28"/>
+          <w:szCs w:val="28"/>
+        </w:rPr>
+        <w:t>logic</w:t>
+      </w:r>
+      <w:r>
+        <w:rPr>
+          <w:rFonts w:ascii="Times New Roman" w:hAnsi="Times New Roman" w:cs="Times New Roman"/>
+          <w:sz w:val="28"/>
+          <w:szCs w:val="28"/>
+        </w:rPr>
+        <w:t xml:space="preserve"> bisnis menggunakan Blade Template. Penggunaan </w:t>
+      </w:r>
+    </w:p>
+    <w:p>
+      <w:pPr>
+        <w:rPr>
+          <w:rFonts w:ascii="Times New Roman" w:hAnsi="Times New Roman" w:cs="Times New Roman"/>
+          <w:sz w:val="28"/>
+          <w:szCs w:val="28"/>
+        </w:rPr>
+      </w:pPr>
+      <w:r>
+        <w:rPr>
+          <w:rFonts w:ascii="Times New Roman" w:hAnsi="Times New Roman" w:cs="Times New Roman"/>
+          <w:sz w:val="28"/>
+          <w:szCs w:val="28"/>
+        </w:rPr>
+        <w:t xml:space="preserve">master.blade.php dan index.blade.php menunjukkan penerapan pola </w:t>
+      </w:r>
+      <w:r>
+        <w:rPr>
+          <w:rFonts w:ascii="Times New Roman" w:hAnsi="Times New Roman" w:cs="Times New Roman"/>
+          <w:b/>
+          <w:bCs/>
+          <w:sz w:val="28"/>
+          <w:szCs w:val="28"/>
+        </w:rPr>
+        <w:t>Don't Repeat Yourself (DRY)</w:t>
+      </w:r>
+      <w:r>
+        <w:rPr>
+          <w:rFonts w:ascii="Times New Roman" w:hAnsi="Times New Roman" w:cs="Times New Roman"/>
+          <w:sz w:val="28"/>
+          <w:szCs w:val="28"/>
+        </w:rPr>
+        <w:t>, di mana elemen umum aplikasi tidak perlu ditulis berulang kali.</w:t>
+      </w:r>
+    </w:p>
+    <w:p>
+      <w:pPr>
+        <w:rPr>
+          <w:rFonts w:ascii="Times New Roman" w:hAnsi="Times New Roman" w:cs="Times New Roman"/>
+          <w:sz w:val="28"/>
+          <w:szCs w:val="28"/>
+        </w:rPr>
+      </w:pPr>
+      <w:r>
+        <w:rPr>
+          <w:rFonts w:ascii="Times New Roman" w:hAnsi="Times New Roman" w:cs="Times New Roman"/>
+          <w:sz w:val="28"/>
+          <w:szCs w:val="28"/>
+        </w:rPr>
+        <w:t>2.</w:t>
+      </w:r>
+      <w:r>
+        <w:rPr>
+          <w:rFonts w:ascii="Times New Roman" w:hAnsi="Times New Roman" w:cs="Times New Roman"/>
+          <w:sz w:val="28"/>
+          <w:szCs w:val="28"/>
+        </w:rPr>
+        <w:t xml:space="preserve">  </w:t>
+      </w:r>
+      <w:r>
+        <w:rPr>
+          <w:rFonts w:ascii="Times New Roman" w:hAnsi="Times New Roman" w:cs="Times New Roman"/>
+          <w:b/>
+          <w:bCs/>
+          <w:sz w:val="28"/>
+          <w:szCs w:val="28"/>
+        </w:rPr>
+        <w:t>Implementasi CRUD Read dan Link</w:t>
+      </w:r>
+      <w:r>
+        <w:rPr>
+          <w:rFonts w:ascii="Times New Roman" w:hAnsi="Times New Roman" w:cs="Times New Roman"/>
+          <w:sz w:val="28"/>
+          <w:szCs w:val="28"/>
+        </w:rPr>
+        <w:t>: Data pegawai berhasil ditampilkan dalam bentuk tabel (</w:t>
+      </w:r>
+      <w:r>
+        <w:rPr>
+          <w:rFonts w:ascii="Times New Roman" w:hAnsi="Times New Roman" w:cs="Times New Roman"/>
+          <w:b/>
+          <w:bCs/>
+          <w:sz w:val="28"/>
+          <w:szCs w:val="28"/>
+        </w:rPr>
+        <w:t>Read</w:t>
+      </w:r>
+      <w:r>
+        <w:rPr>
+          <w:rFonts w:ascii="Times New Roman" w:hAnsi="Times New Roman" w:cs="Times New Roman"/>
+          <w:sz w:val="28"/>
+          <w:szCs w:val="28"/>
+        </w:rPr>
+        <w:t xml:space="preserve">). Kolom aksi berhasil menyediakan </w:t>
+      </w:r>
+    </w:p>
+    <w:p>
+      <w:pPr>
+        <w:rPr>
+          <w:rFonts w:ascii="Times New Roman" w:hAnsi="Times New Roman" w:cs="Times New Roman"/>
+          <w:sz w:val="28"/>
+          <w:szCs w:val="28"/>
+        </w:rPr>
+      </w:pPr>
+      <w:r>
+        <w:rPr>
+          <w:rFonts w:ascii="Times New Roman" w:hAnsi="Times New Roman" w:cs="Times New Roman"/>
+          <w:i/>
+          <w:iCs/>
+          <w:sz w:val="28"/>
+          <w:szCs w:val="28"/>
+        </w:rPr>
+        <w:t>link</w:t>
+      </w:r>
+      <w:r>
+        <w:rPr>
+          <w:rFonts w:ascii="Times New Roman" w:hAnsi="Times New Roman" w:cs="Times New Roman"/>
+          <w:sz w:val="28"/>
+          <w:szCs w:val="28"/>
+        </w:rPr>
+        <w:t xml:space="preserve"> untuk operasi </w:t>
+      </w:r>
+      <w:r>
+        <w:rPr>
+          <w:rFonts w:ascii="Times New Roman" w:hAnsi="Times New Roman" w:cs="Times New Roman"/>
+          <w:b/>
+          <w:bCs/>
+          <w:sz w:val="28"/>
+          <w:szCs w:val="28"/>
+        </w:rPr>
+        <w:t>Detail</w:t>
+      </w:r>
+      <w:r>
+        <w:rPr>
+          <w:rFonts w:ascii="Times New Roman" w:hAnsi="Times New Roman" w:cs="Times New Roman"/>
+          <w:sz w:val="28"/>
+          <w:szCs w:val="28"/>
+        </w:rPr>
+        <w:t xml:space="preserve">, </w:t>
+      </w:r>
+      <w:r>
+        <w:rPr>
+          <w:rFonts w:ascii="Times New Roman" w:hAnsi="Times New Roman" w:cs="Times New Roman"/>
+          <w:b/>
+          <w:bCs/>
+          <w:sz w:val="28"/>
+          <w:szCs w:val="28"/>
+        </w:rPr>
+        <w:t>Edit</w:t>
+      </w:r>
+      <w:r>
+        <w:rPr>
+          <w:rFonts w:ascii="Times New Roman" w:hAnsi="Times New Roman" w:cs="Times New Roman"/>
+          <w:sz w:val="28"/>
+          <w:szCs w:val="28"/>
+        </w:rPr>
+        <w:t xml:space="preserve">, dan </w:t>
+      </w:r>
+      <w:r>
+        <w:rPr>
+          <w:rFonts w:ascii="Times New Roman" w:hAnsi="Times New Roman" w:cs="Times New Roman"/>
+          <w:b/>
+          <w:bCs/>
+          <w:sz w:val="28"/>
+          <w:szCs w:val="28"/>
+        </w:rPr>
+        <w:t>Delete</w:t>
+      </w:r>
+      <w:r>
+        <w:rPr>
+          <w:rFonts w:ascii="Times New Roman" w:hAnsi="Times New Roman" w:cs="Times New Roman"/>
+          <w:sz w:val="28"/>
+          <w:szCs w:val="28"/>
+        </w:rPr>
+        <w:t xml:space="preserve">, yang menunjukkan kesiapan </w:t>
+      </w:r>
+      <w:r>
+        <w:rPr>
+          <w:rFonts w:ascii="Times New Roman" w:hAnsi="Times New Roman" w:cs="Times New Roman"/>
+          <w:i/>
+          <w:iCs/>
+          <w:sz w:val="28"/>
+          <w:szCs w:val="28"/>
+        </w:rPr>
+        <w:t>view</w:t>
+      </w:r>
+      <w:r>
+        <w:rPr>
+          <w:rFonts w:ascii="Times New Roman" w:hAnsi="Times New Roman" w:cs="Times New Roman"/>
+          <w:sz w:val="28"/>
+          <w:szCs w:val="28"/>
+        </w:rPr>
+        <w:t xml:space="preserve"> untuk berinteraksi dengan operasi CRUD lainnya.</w:t>
+      </w:r>
+    </w:p>
+    <w:p>
+      <w:pPr>
+        <w:rPr>
+          <w:rFonts w:ascii="Times New Roman" w:hAnsi="Times New Roman" w:cs="Times New Roman"/>
+          <w:sz w:val="28"/>
+          <w:szCs w:val="28"/>
+        </w:rPr>
+      </w:pPr>
+      <w:r>
+        <w:rPr>
+          <w:rFonts w:ascii="Times New Roman" w:hAnsi="Times New Roman" w:cs="Times New Roman"/>
+          <w:sz w:val="28"/>
+          <w:szCs w:val="28"/>
+        </w:rPr>
+        <w:t>3.</w:t>
+      </w:r>
+      <w:r>
+        <w:rPr>
+          <w:rFonts w:ascii="Times New Roman" w:hAnsi="Times New Roman" w:cs="Times New Roman"/>
+          <w:sz w:val="28"/>
+          <w:szCs w:val="28"/>
+        </w:rPr>
+        <w:t xml:space="preserve">  </w:t>
+      </w:r>
+      <w:r>
+        <w:rPr>
+          <w:rFonts w:ascii="Times New Roman" w:hAnsi="Times New Roman" w:cs="Times New Roman"/>
+          <w:b/>
+          <w:bCs/>
+          <w:sz w:val="28"/>
+          <w:szCs w:val="28"/>
+        </w:rPr>
+        <w:t>Metode DELETE yang Benar</w:t>
+      </w:r>
+      <w:r>
+        <w:rPr>
+          <w:rFonts w:ascii="Times New Roman" w:hAnsi="Times New Roman" w:cs="Times New Roman"/>
+          <w:sz w:val="28"/>
+          <w:szCs w:val="28"/>
+        </w:rPr>
+        <w:t xml:space="preserve">: Penggunaan &lt;form&gt; dengan </w:t>
+      </w:r>
+      <w:r>
+        <w:rPr>
+          <w:rFonts w:ascii="Times New Roman" w:hAnsi="Times New Roman" w:cs="Times New Roman"/>
+          <w:b/>
+          <w:bCs/>
+          <w:sz w:val="28"/>
+          <w:szCs w:val="28"/>
+        </w:rPr>
+        <w:t>@method('DELETE')</w:t>
+      </w:r>
+      <w:r>
+        <w:rPr>
+          <w:rFonts w:ascii="Times New Roman" w:hAnsi="Times New Roman" w:cs="Times New Roman"/>
+          <w:sz w:val="28"/>
+          <w:szCs w:val="28"/>
+        </w:rPr>
+        <w:t xml:space="preserve"> untuk operasi penghapusan adalah praktik yang benar dalam Laravel. Hal ini memastikan bahwa operasi penghapusan dilakukan melalui </w:t>
+      </w:r>
+    </w:p>
+    <w:p>
+      <w:pPr>
+        <w:rPr>
+          <w:rFonts w:ascii="Times New Roman" w:hAnsi="Times New Roman" w:cs="Times New Roman"/>
+          <w:sz w:val="28"/>
+          <w:szCs w:val="28"/>
+        </w:rPr>
+      </w:pPr>
+      <w:r>
+        <w:rPr>
+          <w:rFonts w:ascii="Times New Roman" w:hAnsi="Times New Roman" w:cs="Times New Roman"/>
+          <w:i/>
+          <w:iCs/>
+          <w:sz w:val="28"/>
+          <w:szCs w:val="28"/>
+        </w:rPr>
+        <w:t>request</w:t>
+      </w:r>
+      <w:r>
+        <w:rPr>
+          <w:rFonts w:ascii="Times New Roman" w:hAnsi="Times New Roman" w:cs="Times New Roman"/>
+          <w:sz w:val="28"/>
+          <w:szCs w:val="28"/>
+        </w:rPr>
+        <w:t xml:space="preserve"> HTTP DELETE, bukan GET atau POST biasa.</w:t>
+      </w:r>
+    </w:p>
+    <w:p>
+      <w:pPr>
+        <w:rPr>
+          <w:rFonts w:ascii="Times New Roman" w:hAnsi="Times New Roman" w:cs="Times New Roman"/>
+          <w:sz w:val="28"/>
+          <w:szCs w:val="28"/>
+        </w:rPr>
+      </w:pPr>
+      <w:r>
+        <w:rPr>
+          <w:rFonts w:ascii="Times New Roman" w:hAnsi="Times New Roman" w:cs="Times New Roman"/>
+          <w:sz w:val="28"/>
+          <w:szCs w:val="28"/>
+        </w:rPr>
+        <w:t>4.</w:t>
+      </w:r>
+      <w:r>
+        <w:rPr>
+          <w:rFonts w:ascii="Times New Roman" w:hAnsi="Times New Roman" w:cs="Times New Roman"/>
+          <w:sz w:val="28"/>
+          <w:szCs w:val="28"/>
+        </w:rPr>
+        <w:t xml:space="preserve">  </w:t>
+      </w:r>
+      <w:r>
+        <w:rPr>
+          <w:rFonts w:ascii="Times New Roman" w:hAnsi="Times New Roman" w:cs="Times New Roman"/>
+          <w:b/>
+          <w:bCs/>
+          <w:sz w:val="28"/>
+          <w:szCs w:val="28"/>
+        </w:rPr>
+        <w:t>Tampilan Output</w:t>
+      </w:r>
+      <w:r>
+        <w:rPr>
+          <w:rFonts w:ascii="Times New Roman" w:hAnsi="Times New Roman" w:cs="Times New Roman"/>
+          <w:sz w:val="28"/>
+          <w:szCs w:val="28"/>
+        </w:rPr>
+        <w:t xml:space="preserve">: </w:t>
+      </w:r>
+      <w:r>
+        <w:rPr>
+          <w:rFonts w:ascii="Times New Roman" w:hAnsi="Times New Roman" w:cs="Times New Roman"/>
+          <w:i/>
+          <w:iCs/>
+          <w:sz w:val="28"/>
+          <w:szCs w:val="28"/>
+        </w:rPr>
+        <w:t>Output</w:t>
+      </w:r>
+      <w:r>
+        <w:rPr>
+          <w:rFonts w:ascii="Times New Roman" w:hAnsi="Times New Roman" w:cs="Times New Roman"/>
+          <w:sz w:val="28"/>
+          <w:szCs w:val="28"/>
+        </w:rPr>
+        <w:t xml:space="preserve"> menunjukkan bahwa </w:t>
+      </w:r>
+      <w:r>
+        <w:rPr>
+          <w:rFonts w:ascii="Times New Roman" w:hAnsi="Times New Roman" w:cs="Times New Roman"/>
+          <w:i/>
+          <w:iCs/>
+          <w:sz w:val="28"/>
+          <w:szCs w:val="28"/>
+        </w:rPr>
+        <w:t>layout</w:t>
+      </w:r>
+      <w:r>
+        <w:rPr>
+          <w:rFonts w:ascii="Times New Roman" w:hAnsi="Times New Roman" w:cs="Times New Roman"/>
+          <w:sz w:val="28"/>
+          <w:szCs w:val="28"/>
+        </w:rPr>
+        <w:t xml:space="preserve"> master dan konten index berhasil digabungkan, menampilkan </w:t>
+      </w:r>
+      <w:r>
+        <w:rPr>
+          <w:rFonts w:ascii="Times New Roman" w:hAnsi="Times New Roman" w:cs="Times New Roman"/>
+          <w:i/>
+          <w:iCs/>
+          <w:sz w:val="28"/>
+          <w:szCs w:val="28"/>
+        </w:rPr>
+        <w:t>header</w:t>
+      </w:r>
+      <w:r>
+        <w:rPr>
+          <w:rFonts w:ascii="Times New Roman" w:hAnsi="Times New Roman" w:cs="Times New Roman"/>
+          <w:sz w:val="28"/>
+          <w:szCs w:val="28"/>
+        </w:rPr>
+        <w:t xml:space="preserve"> navigasi, dan tabel data pegawai dengan lengkap dan fungsional.</w:t>
+      </w:r>
+    </w:p>
+    <w:p>
+      <w:pPr>
+        <w:rPr>
+          <w:rFonts w:ascii="Times New Roman" w:hAnsi="Times New Roman" w:cs="Times New Roman"/>
+          <w:sz w:val="28"/>
+          <w:szCs w:val="28"/>
+        </w:rPr>
+      </w:pPr>
+    </w:p>
+    <w:p>
+      <w:pPr>
+        <w:rPr>
+          <w:rFonts w:ascii="Times New Roman" w:hAnsi="Times New Roman" w:cs="Times New Roman"/>
+          <w:b/>
+          <w:bCs/>
+          <w:sz w:val="32"/>
+          <w:szCs w:val="32"/>
+        </w:rPr>
+      </w:pPr>
+      <w:r>
+        <w:rPr>
+          <w:rFonts w:ascii="Times New Roman" w:hAnsi="Times New Roman" w:cs="Times New Roman"/>
+          <w:b/>
+          <w:bCs/>
+          <w:sz w:val="32"/>
+          <w:szCs w:val="32"/>
+        </w:rPr>
+        <w:t>F</w:t>
+      </w:r>
+      <w:r>
+        <w:rPr>
+          <w:rFonts w:ascii="Times New Roman" w:hAnsi="Times New Roman" w:cs="Times New Roman"/>
+          <w:b/>
+          <w:bCs/>
+          <w:sz w:val="32"/>
+          <w:szCs w:val="32"/>
+        </w:rPr>
+        <w:t>.</w:t>
       </w:r>
       <w:r>
         <w:rPr>
@@ -702,30 +3423,360 @@
       <w:pPr>
         <w:rPr>
           <w:rFonts w:ascii="Times New Roman" w:hAnsi="Times New Roman" w:cs="Times New Roman"/>
-          <w:sz w:val="32"/>
-          <w:szCs w:val="32"/>
-        </w:rPr>
-      </w:pPr>
-    </w:p>
-    <w:p>
-      <w:pPr>
-        <w:rPr>
-          <w:rFonts w:ascii="Times New Roman" w:hAnsi="Times New Roman" w:cs="Times New Roman"/>
-          <w:b/>
-          <w:bCs/>
-          <w:sz w:val="32"/>
-          <w:szCs w:val="32"/>
-        </w:rPr>
-      </w:pPr>
-      <w:r>
-        <w:rPr>
-          <w:rFonts w:ascii="Times New Roman" w:hAnsi="Times New Roman" w:cs="Times New Roman"/>
-          <w:b/>
-          <w:bCs/>
-          <w:sz w:val="32"/>
-          <w:szCs w:val="32"/>
-        </w:rPr>
-        <w:t>F</w:t>
+          <w:sz w:val="28"/>
+          <w:szCs w:val="28"/>
+        </w:rPr>
+      </w:pPr>
+      <w:r>
+        <w:rPr>
+          <w:rFonts w:ascii="Times New Roman" w:hAnsi="Times New Roman" w:cs="Times New Roman"/>
+          <w:sz w:val="28"/>
+          <w:szCs w:val="28"/>
+        </w:rPr>
+        <w:t>1.</w:t>
+      </w:r>
+      <w:r>
+        <w:rPr>
+          <w:rFonts w:ascii="Times New Roman" w:hAnsi="Times New Roman" w:cs="Times New Roman"/>
+          <w:sz w:val="28"/>
+          <w:szCs w:val="28"/>
+        </w:rPr>
+        <w:t xml:space="preserve">  Proyek </w:t>
+      </w:r>
+    </w:p>
+    <w:p>
+      <w:pPr>
+        <w:rPr>
+          <w:rFonts w:ascii="Times New Roman" w:hAnsi="Times New Roman" w:cs="Times New Roman"/>
+          <w:sz w:val="28"/>
+          <w:szCs w:val="28"/>
+        </w:rPr>
+      </w:pPr>
+      <w:r>
+        <w:rPr>
+          <w:rFonts w:ascii="Times New Roman" w:hAnsi="Times New Roman" w:cs="Times New Roman"/>
+          <w:b/>
+          <w:bCs/>
+          <w:sz w:val="28"/>
+          <w:szCs w:val="28"/>
+        </w:rPr>
+        <w:t xml:space="preserve">CRUD </w:t>
+      </w:r>
+      <w:r>
+        <w:rPr>
+          <w:rFonts w:ascii="Times New Roman" w:hAnsi="Times New Roman" w:cs="Times New Roman"/>
+          <w:b/>
+          <w:bCs/>
+          <w:i/>
+          <w:iCs/>
+          <w:sz w:val="28"/>
+          <w:szCs w:val="28"/>
+        </w:rPr>
+        <w:t>with</w:t>
+      </w:r>
+      <w:r>
+        <w:rPr>
+          <w:rFonts w:ascii="Times New Roman" w:hAnsi="Times New Roman" w:cs="Times New Roman"/>
+          <w:b/>
+          <w:bCs/>
+          <w:sz w:val="28"/>
+          <w:szCs w:val="28"/>
+        </w:rPr>
+        <w:t xml:space="preserve"> Laravel</w:t>
+      </w:r>
+      <w:r>
+        <w:rPr>
+          <w:rFonts w:ascii="Times New Roman" w:hAnsi="Times New Roman" w:cs="Times New Roman"/>
+          <w:sz w:val="28"/>
+          <w:szCs w:val="28"/>
+        </w:rPr>
+        <w:t xml:space="preserve"> telah berhasil diselesaikan dengan fokus pada persiapan </w:t>
+      </w:r>
+      <w:r>
+        <w:rPr>
+          <w:rFonts w:ascii="Times New Roman" w:hAnsi="Times New Roman" w:cs="Times New Roman"/>
+          <w:i/>
+          <w:iCs/>
+          <w:sz w:val="28"/>
+          <w:szCs w:val="28"/>
+        </w:rPr>
+        <w:t>template</w:t>
+      </w:r>
+      <w:r>
+        <w:rPr>
+          <w:rFonts w:ascii="Times New Roman" w:hAnsi="Times New Roman" w:cs="Times New Roman"/>
+          <w:sz w:val="28"/>
+          <w:szCs w:val="28"/>
+        </w:rPr>
+        <w:t xml:space="preserve"> dan implementasi tampilan daftar data (</w:t>
+      </w:r>
+      <w:r>
+        <w:rPr>
+          <w:rFonts w:ascii="Times New Roman" w:hAnsi="Times New Roman" w:cs="Times New Roman"/>
+          <w:b/>
+          <w:bCs/>
+          <w:sz w:val="28"/>
+          <w:szCs w:val="28"/>
+        </w:rPr>
+        <w:t>Read</w:t>
+      </w:r>
+      <w:r>
+        <w:rPr>
+          <w:rFonts w:ascii="Times New Roman" w:hAnsi="Times New Roman" w:cs="Times New Roman"/>
+          <w:sz w:val="28"/>
+          <w:szCs w:val="28"/>
+        </w:rPr>
+        <w:t xml:space="preserve"> data) pegawai.</w:t>
+      </w:r>
+    </w:p>
+    <w:p>
+      <w:pPr>
+        <w:rPr>
+          <w:rFonts w:ascii="Times New Roman" w:hAnsi="Times New Roman" w:cs="Times New Roman"/>
+          <w:sz w:val="28"/>
+          <w:szCs w:val="28"/>
+        </w:rPr>
+      </w:pPr>
+      <w:r>
+        <w:rPr>
+          <w:rFonts w:ascii="Times New Roman" w:hAnsi="Times New Roman" w:cs="Times New Roman"/>
+          <w:sz w:val="28"/>
+          <w:szCs w:val="28"/>
+        </w:rPr>
+        <w:t>2.</w:t>
+      </w:r>
+      <w:r>
+        <w:rPr>
+          <w:rFonts w:ascii="Times New Roman" w:hAnsi="Times New Roman" w:cs="Times New Roman"/>
+          <w:sz w:val="28"/>
+          <w:szCs w:val="28"/>
+        </w:rPr>
+        <w:t xml:space="preserve">  </w:t>
+      </w:r>
+      <w:r>
+        <w:rPr>
+          <w:rFonts w:ascii="Times New Roman" w:hAnsi="Times New Roman" w:cs="Times New Roman"/>
+          <w:b/>
+          <w:bCs/>
+          <w:sz w:val="28"/>
+          <w:szCs w:val="28"/>
+        </w:rPr>
+        <w:t>Blade Templating</w:t>
+      </w:r>
+      <w:r>
+        <w:rPr>
+          <w:rFonts w:ascii="Times New Roman" w:hAnsi="Times New Roman" w:cs="Times New Roman"/>
+          <w:sz w:val="28"/>
+          <w:szCs w:val="28"/>
+        </w:rPr>
+        <w:t xml:space="preserve"> (melalui master.blade.php dan index.blade.php) berhasil digunakan untuk menciptakan antarmuka pengguna yang terstruktur dan konsisten.</w:t>
+      </w:r>
+    </w:p>
+    <w:p>
+      <w:pPr>
+        <w:rPr>
+          <w:rFonts w:ascii="Times New Roman" w:hAnsi="Times New Roman" w:cs="Times New Roman"/>
+          <w:sz w:val="28"/>
+          <w:szCs w:val="28"/>
+        </w:rPr>
+      </w:pPr>
+      <w:r>
+        <w:rPr>
+          <w:rFonts w:ascii="Times New Roman" w:hAnsi="Times New Roman" w:cs="Times New Roman"/>
+          <w:sz w:val="28"/>
+          <w:szCs w:val="28"/>
+        </w:rPr>
+        <w:t>3.</w:t>
+      </w:r>
+      <w:r>
+        <w:rPr>
+          <w:rFonts w:ascii="Times New Roman" w:hAnsi="Times New Roman" w:cs="Times New Roman"/>
+          <w:sz w:val="28"/>
+          <w:szCs w:val="28"/>
+        </w:rPr>
+        <w:t xml:space="preserve">  Fungsionalitas dasar untuk melihat data pegawai, serta </w:t>
+      </w:r>
+    </w:p>
+    <w:p>
+      <w:pPr>
+        <w:rPr>
+          <w:rFonts w:ascii="Times New Roman" w:hAnsi="Times New Roman" w:cs="Times New Roman"/>
+          <w:sz w:val="28"/>
+          <w:szCs w:val="28"/>
+        </w:rPr>
+      </w:pPr>
+      <w:r>
+        <w:rPr>
+          <w:rFonts w:ascii="Times New Roman" w:hAnsi="Times New Roman" w:cs="Times New Roman"/>
+          <w:i/>
+          <w:iCs/>
+          <w:sz w:val="28"/>
+          <w:szCs w:val="28"/>
+        </w:rPr>
+        <w:t>link</w:t>
+      </w:r>
+      <w:r>
+        <w:rPr>
+          <w:rFonts w:ascii="Times New Roman" w:hAnsi="Times New Roman" w:cs="Times New Roman"/>
+          <w:sz w:val="28"/>
+          <w:szCs w:val="28"/>
+        </w:rPr>
+        <w:t xml:space="preserve"> untuk </w:t>
+      </w:r>
+      <w:r>
+        <w:rPr>
+          <w:rFonts w:ascii="Times New Roman" w:hAnsi="Times New Roman" w:cs="Times New Roman"/>
+          <w:b/>
+          <w:bCs/>
+          <w:sz w:val="28"/>
+          <w:szCs w:val="28"/>
+        </w:rPr>
+        <w:t>Detail</w:t>
+      </w:r>
+      <w:r>
+        <w:rPr>
+          <w:rFonts w:ascii="Times New Roman" w:hAnsi="Times New Roman" w:cs="Times New Roman"/>
+          <w:sz w:val="28"/>
+          <w:szCs w:val="28"/>
+        </w:rPr>
+        <w:t xml:space="preserve">, </w:t>
+      </w:r>
+      <w:r>
+        <w:rPr>
+          <w:rFonts w:ascii="Times New Roman" w:hAnsi="Times New Roman" w:cs="Times New Roman"/>
+          <w:b/>
+          <w:bCs/>
+          <w:sz w:val="28"/>
+          <w:szCs w:val="28"/>
+        </w:rPr>
+        <w:t>Edit</w:t>
+      </w:r>
+      <w:r>
+        <w:rPr>
+          <w:rFonts w:ascii="Times New Roman" w:hAnsi="Times New Roman" w:cs="Times New Roman"/>
+          <w:sz w:val="28"/>
+          <w:szCs w:val="28"/>
+        </w:rPr>
+        <w:t xml:space="preserve">, dan </w:t>
+      </w:r>
+      <w:r>
+        <w:rPr>
+          <w:rFonts w:ascii="Times New Roman" w:hAnsi="Times New Roman" w:cs="Times New Roman"/>
+          <w:b/>
+          <w:bCs/>
+          <w:sz w:val="28"/>
+          <w:szCs w:val="28"/>
+        </w:rPr>
+        <w:t>Delete</w:t>
+      </w:r>
+      <w:r>
+        <w:rPr>
+          <w:rFonts w:ascii="Times New Roman" w:hAnsi="Times New Roman" w:cs="Times New Roman"/>
+          <w:sz w:val="28"/>
+          <w:szCs w:val="28"/>
+        </w:rPr>
+        <w:t xml:space="preserve"> sudah siap diakses, menunjukkan fondasi yang kuat untuk menyelesaikan seluruh operasi CRUD.</w:t>
+      </w:r>
+    </w:p>
+    <w:p>
+      <w:pPr>
+        <w:rPr>
+          <w:rFonts w:ascii="Times New Roman" w:hAnsi="Times New Roman" w:cs="Times New Roman"/>
+          <w:sz w:val="28"/>
+          <w:szCs w:val="28"/>
+        </w:rPr>
+      </w:pPr>
+      <w:r>
+        <w:rPr>
+          <w:rFonts w:ascii="Times New Roman" w:hAnsi="Times New Roman" w:cs="Times New Roman"/>
+          <w:sz w:val="28"/>
+          <w:szCs w:val="28"/>
+        </w:rPr>
+        <w:t>4.</w:t>
+      </w:r>
+      <w:r>
+        <w:rPr>
+          <w:rFonts w:ascii="Times New Roman" w:hAnsi="Times New Roman" w:cs="Times New Roman"/>
+          <w:sz w:val="28"/>
+          <w:szCs w:val="28"/>
+        </w:rPr>
+        <w:t xml:space="preserve">  Semua kode yang dibuat sudah diunggah dan tersedia di </w:t>
+      </w:r>
+    </w:p>
+    <w:p>
+      <w:pPr>
+        <w:rPr>
+          <w:rFonts w:ascii="Times New Roman" w:hAnsi="Times New Roman" w:cs="Times New Roman"/>
+          <w:sz w:val="28"/>
+          <w:szCs w:val="28"/>
+        </w:rPr>
+      </w:pPr>
+      <w:r>
+        <w:rPr>
+          <w:rFonts w:ascii="Times New Roman" w:hAnsi="Times New Roman" w:cs="Times New Roman"/>
+          <w:b/>
+          <w:bCs/>
+          <w:sz w:val="28"/>
+          <w:szCs w:val="28"/>
+        </w:rPr>
+        <w:t>GitHub</w:t>
+      </w:r>
+      <w:r>
+        <w:rPr>
+          <w:rFonts w:ascii="Times New Roman" w:hAnsi="Times New Roman" w:cs="Times New Roman"/>
+          <w:sz w:val="28"/>
+          <w:szCs w:val="28"/>
+        </w:rPr>
+        <w:t xml:space="preserve"> pada </w:t>
+      </w:r>
+      <w:r>
+        <w:rPr>
+          <w:rFonts w:ascii="Times New Roman" w:hAnsi="Times New Roman" w:cs="Times New Roman"/>
+          <w:i/>
+          <w:iCs/>
+          <w:sz w:val="28"/>
+          <w:szCs w:val="28"/>
+        </w:rPr>
+        <w:t>link</w:t>
+      </w:r>
+      <w:r>
+        <w:rPr>
+          <w:rFonts w:ascii="Times New Roman" w:hAnsi="Times New Roman" w:cs="Times New Roman"/>
+          <w:sz w:val="28"/>
+          <w:szCs w:val="28"/>
+        </w:rPr>
+        <w:t xml:space="preserve"> yang telah disediakan.</w:t>
+      </w:r>
+    </w:p>
+    <w:p>
+      <w:pPr>
+        <w:rPr>
+          <w:rFonts w:ascii="Times New Roman" w:hAnsi="Times New Roman" w:cs="Times New Roman"/>
+          <w:sz w:val="28"/>
+          <w:szCs w:val="28"/>
+        </w:rPr>
+      </w:pPr>
+    </w:p>
+    <w:p>
+      <w:pPr>
+        <w:rPr>
+          <w:rFonts w:ascii="Times New Roman" w:hAnsi="Times New Roman" w:cs="Times New Roman"/>
+          <w:b/>
+          <w:bCs/>
+          <w:sz w:val="32"/>
+          <w:szCs w:val="32"/>
+        </w:rPr>
+      </w:pPr>
+      <w:r>
+        <w:rPr>
+          <w:rFonts w:ascii="Times New Roman" w:hAnsi="Times New Roman" w:cs="Times New Roman"/>
+          <w:b/>
+          <w:bCs/>
+          <w:sz w:val="32"/>
+          <w:szCs w:val="32"/>
+        </w:rPr>
+        <w:lastRenderedPageBreak/>
+        <w:t>G</w:t>
       </w:r>
       <w:r>
         <w:rPr>
@@ -746,7 +3797,7 @@
           <w:szCs w:val="28"/>
         </w:rPr>
       </w:pPr>
-      <w:hyperlink r:id="rId9" w:history="1">
+      <w:hyperlink r:id="rId10" w:history="1">
         <w:r>
           <w:rPr>
             <w:rStyle w:val="Hyperlink"/>
@@ -1298,6 +4349,118 @@
     </w:lvl>
   </w:abstractNum>
   <w:abstractNum w:abstractNumId="4" w15:restartNumberingAfterBreak="0">
+    <w:nsid w:val="1F7347AA"/>
+    <w:multiLevelType w:val="hybridMultilevel"/>
+    <w:tmpl w:val="0A5483AA"/>
+    <w:lvl w:ilvl="0" w:tplc="4AA4FA8A">
+      <w:numFmt w:val="bullet"/>
+      <w:lvlText w:val=""/>
+      <w:lvlJc w:val="left"/>
+      <w:pPr>
+        <w:ind w:left="765" w:hanging="405"/>
+      </w:pPr>
+      <w:rPr>
+        <w:rFonts w:ascii="Times New Roman" w:eastAsiaTheme="minorHAnsi" w:hAnsi="Times New Roman" w:cs="Times New Roman" w:hint="default"/>
+      </w:rPr>
+    </w:lvl>
+    <w:lvl w:ilvl="1" w:tplc="04090003" w:tentative="1">
+      <w:start w:val="1"/>
+      <w:numFmt w:val="bullet"/>
+      <w:lvlText w:val="o"/>
+      <w:lvlJc w:val="left"/>
+      <w:pPr>
+        <w:ind w:left="1440" w:hanging="360"/>
+      </w:pPr>
+      <w:rPr>
+        <w:rFonts w:ascii="Courier New" w:hAnsi="Courier New" w:cs="Courier New" w:hint="default"/>
+      </w:rPr>
+    </w:lvl>
+    <w:lvl w:ilvl="2" w:tplc="04090005" w:tentative="1">
+      <w:start w:val="1"/>
+      <w:numFmt w:val="bullet"/>
+      <w:lvlText w:val=""/>
+      <w:lvlJc w:val="left"/>
+      <w:pPr>
+        <w:ind w:left="2160" w:hanging="360"/>
+      </w:pPr>
+      <w:rPr>
+        <w:rFonts w:ascii="Wingdings" w:hAnsi="Wingdings" w:hint="default"/>
+      </w:rPr>
+    </w:lvl>
+    <w:lvl w:ilvl="3" w:tplc="04090001" w:tentative="1">
+      <w:start w:val="1"/>
+      <w:numFmt w:val="bullet"/>
+      <w:lvlText w:val=""/>
+      <w:lvlJc w:val="left"/>
+      <w:pPr>
+        <w:ind w:left="2880" w:hanging="360"/>
+      </w:pPr>
+      <w:rPr>
+        <w:rFonts w:ascii="Symbol" w:hAnsi="Symbol" w:hint="default"/>
+      </w:rPr>
+    </w:lvl>
+    <w:lvl w:ilvl="4" w:tplc="04090003" w:tentative="1">
+      <w:start w:val="1"/>
+      <w:numFmt w:val="bullet"/>
+      <w:lvlText w:val="o"/>
+      <w:lvlJc w:val="left"/>
+      <w:pPr>
+        <w:ind w:left="3600" w:hanging="360"/>
+      </w:pPr>
+      <w:rPr>
+        <w:rFonts w:ascii="Courier New" w:hAnsi="Courier New" w:cs="Courier New" w:hint="default"/>
+      </w:rPr>
+    </w:lvl>
+    <w:lvl w:ilvl="5" w:tplc="04090005" w:tentative="1">
+      <w:start w:val="1"/>
+      <w:numFmt w:val="bullet"/>
+      <w:lvlText w:val=""/>
+      <w:lvlJc w:val="left"/>
+      <w:pPr>
+        <w:ind w:left="4320" w:hanging="360"/>
+      </w:pPr>
+      <w:rPr>
+        <w:rFonts w:ascii="Wingdings" w:hAnsi="Wingdings" w:hint="default"/>
+      </w:rPr>
+    </w:lvl>
+    <w:lvl w:ilvl="6" w:tplc="04090001" w:tentative="1">
+      <w:start w:val="1"/>
+      <w:numFmt w:val="bullet"/>
+      <w:lvlText w:val=""/>
+      <w:lvlJc w:val="left"/>
+      <w:pPr>
+        <w:ind w:left="5040" w:hanging="360"/>
+      </w:pPr>
+      <w:rPr>
+        <w:rFonts w:ascii="Symbol" w:hAnsi="Symbol" w:hint="default"/>
+      </w:rPr>
+    </w:lvl>
+    <w:lvl w:ilvl="7" w:tplc="04090003" w:tentative="1">
+      <w:start w:val="1"/>
+      <w:numFmt w:val="bullet"/>
+      <w:lvlText w:val="o"/>
+      <w:lvlJc w:val="left"/>
+      <w:pPr>
+        <w:ind w:left="5760" w:hanging="360"/>
+      </w:pPr>
+      <w:rPr>
+        <w:rFonts w:ascii="Courier New" w:hAnsi="Courier New" w:cs="Courier New" w:hint="default"/>
+      </w:rPr>
+    </w:lvl>
+    <w:lvl w:ilvl="8" w:tplc="04090005" w:tentative="1">
+      <w:start w:val="1"/>
+      <w:numFmt w:val="bullet"/>
+      <w:lvlText w:val=""/>
+      <w:lvlJc w:val="left"/>
+      <w:pPr>
+        <w:ind w:left="6480" w:hanging="360"/>
+      </w:pPr>
+      <w:rPr>
+        <w:rFonts w:ascii="Wingdings" w:hAnsi="Wingdings" w:hint="default"/>
+      </w:rPr>
+    </w:lvl>
+  </w:abstractNum>
+  <w:abstractNum w:abstractNumId="5" w15:restartNumberingAfterBreak="0">
     <w:nsid w:val="22857B52"/>
     <w:multiLevelType w:val="hybridMultilevel"/>
     <w:tmpl w:val="18086B74"/>
@@ -1410,7 +4573,7 @@
       </w:rPr>
     </w:lvl>
   </w:abstractNum>
-  <w:abstractNum w:abstractNumId="5" w15:restartNumberingAfterBreak="0">
+  <w:abstractNum w:abstractNumId="6" w15:restartNumberingAfterBreak="0">
     <w:nsid w:val="24EE7AC5"/>
     <w:multiLevelType w:val="hybridMultilevel"/>
     <w:tmpl w:val="91FE26AE"/>
@@ -1522,7 +4685,7 @@
       </w:rPr>
     </w:lvl>
   </w:abstractNum>
-  <w:abstractNum w:abstractNumId="6" w15:restartNumberingAfterBreak="0">
+  <w:abstractNum w:abstractNumId="7" w15:restartNumberingAfterBreak="0">
     <w:nsid w:val="35FF4138"/>
     <w:multiLevelType w:val="hybridMultilevel"/>
     <w:tmpl w:val="96D62ACC"/>
@@ -1635,7 +4798,119 @@
       </w:rPr>
     </w:lvl>
   </w:abstractNum>
-  <w:abstractNum w:abstractNumId="7" w15:restartNumberingAfterBreak="0">
+  <w:abstractNum w:abstractNumId="8" w15:restartNumberingAfterBreak="0">
+    <w:nsid w:val="38210BB3"/>
+    <w:multiLevelType w:val="hybridMultilevel"/>
+    <w:tmpl w:val="18F01F78"/>
+    <w:lvl w:ilvl="0" w:tplc="AEE6472E">
+      <w:numFmt w:val="bullet"/>
+      <w:lvlText w:val=""/>
+      <w:lvlJc w:val="left"/>
+      <w:pPr>
+        <w:ind w:left="765" w:hanging="405"/>
+      </w:pPr>
+      <w:rPr>
+        <w:rFonts w:ascii="Times New Roman" w:eastAsiaTheme="minorHAnsi" w:hAnsi="Times New Roman" w:cs="Times New Roman" w:hint="default"/>
+      </w:rPr>
+    </w:lvl>
+    <w:lvl w:ilvl="1" w:tplc="04090003" w:tentative="1">
+      <w:start w:val="1"/>
+      <w:numFmt w:val="bullet"/>
+      <w:lvlText w:val="o"/>
+      <w:lvlJc w:val="left"/>
+      <w:pPr>
+        <w:ind w:left="1440" w:hanging="360"/>
+      </w:pPr>
+      <w:rPr>
+        <w:rFonts w:ascii="Courier New" w:hAnsi="Courier New" w:cs="Courier New" w:hint="default"/>
+      </w:rPr>
+    </w:lvl>
+    <w:lvl w:ilvl="2" w:tplc="04090005" w:tentative="1">
+      <w:start w:val="1"/>
+      <w:numFmt w:val="bullet"/>
+      <w:lvlText w:val=""/>
+      <w:lvlJc w:val="left"/>
+      <w:pPr>
+        <w:ind w:left="2160" w:hanging="360"/>
+      </w:pPr>
+      <w:rPr>
+        <w:rFonts w:ascii="Wingdings" w:hAnsi="Wingdings" w:hint="default"/>
+      </w:rPr>
+    </w:lvl>
+    <w:lvl w:ilvl="3" w:tplc="04090001" w:tentative="1">
+      <w:start w:val="1"/>
+      <w:numFmt w:val="bullet"/>
+      <w:lvlText w:val=""/>
+      <w:lvlJc w:val="left"/>
+      <w:pPr>
+        <w:ind w:left="2880" w:hanging="360"/>
+      </w:pPr>
+      <w:rPr>
+        <w:rFonts w:ascii="Symbol" w:hAnsi="Symbol" w:hint="default"/>
+      </w:rPr>
+    </w:lvl>
+    <w:lvl w:ilvl="4" w:tplc="04090003" w:tentative="1">
+      <w:start w:val="1"/>
+      <w:numFmt w:val="bullet"/>
+      <w:lvlText w:val="o"/>
+      <w:lvlJc w:val="left"/>
+      <w:pPr>
+        <w:ind w:left="3600" w:hanging="360"/>
+      </w:pPr>
+      <w:rPr>
+        <w:rFonts w:ascii="Courier New" w:hAnsi="Courier New" w:cs="Courier New" w:hint="default"/>
+      </w:rPr>
+    </w:lvl>
+    <w:lvl w:ilvl="5" w:tplc="04090005" w:tentative="1">
+      <w:start w:val="1"/>
+      <w:numFmt w:val="bullet"/>
+      <w:lvlText w:val=""/>
+      <w:lvlJc w:val="left"/>
+      <w:pPr>
+        <w:ind w:left="4320" w:hanging="360"/>
+      </w:pPr>
+      <w:rPr>
+        <w:rFonts w:ascii="Wingdings" w:hAnsi="Wingdings" w:hint="default"/>
+      </w:rPr>
+    </w:lvl>
+    <w:lvl w:ilvl="6" w:tplc="04090001" w:tentative="1">
+      <w:start w:val="1"/>
+      <w:numFmt w:val="bullet"/>
+      <w:lvlText w:val=""/>
+      <w:lvlJc w:val="left"/>
+      <w:pPr>
+        <w:ind w:left="5040" w:hanging="360"/>
+      </w:pPr>
+      <w:rPr>
+        <w:rFonts w:ascii="Symbol" w:hAnsi="Symbol" w:hint="default"/>
+      </w:rPr>
+    </w:lvl>
+    <w:lvl w:ilvl="7" w:tplc="04090003" w:tentative="1">
+      <w:start w:val="1"/>
+      <w:numFmt w:val="bullet"/>
+      <w:lvlText w:val="o"/>
+      <w:lvlJc w:val="left"/>
+      <w:pPr>
+        <w:ind w:left="5760" w:hanging="360"/>
+      </w:pPr>
+      <w:rPr>
+        <w:rFonts w:ascii="Courier New" w:hAnsi="Courier New" w:cs="Courier New" w:hint="default"/>
+      </w:rPr>
+    </w:lvl>
+    <w:lvl w:ilvl="8" w:tplc="04090005" w:tentative="1">
+      <w:start w:val="1"/>
+      <w:numFmt w:val="bullet"/>
+      <w:lvlText w:val=""/>
+      <w:lvlJc w:val="left"/>
+      <w:pPr>
+        <w:ind w:left="6480" w:hanging="360"/>
+      </w:pPr>
+      <w:rPr>
+        <w:rFonts w:ascii="Wingdings" w:hAnsi="Wingdings" w:hint="default"/>
+      </w:rPr>
+    </w:lvl>
+  </w:abstractNum>
+  <w:abstractNum w:abstractNumId="9" w15:restartNumberingAfterBreak="0">
     <w:nsid w:val="39CF71C2"/>
     <w:multiLevelType w:val="multilevel"/>
     <w:tmpl w:val="CD0A8A62"/>
@@ -1784,7 +5059,540 @@
       </w:rPr>
     </w:lvl>
   </w:abstractNum>
-  <w:abstractNum w:abstractNumId="8" w15:restartNumberingAfterBreak="0">
+  <w:abstractNum w:abstractNumId="10" w15:restartNumberingAfterBreak="0">
+    <w:nsid w:val="3AB50441"/>
+    <w:multiLevelType w:val="multilevel"/>
+    <w:tmpl w:val="BB7E6424"/>
+    <w:lvl w:ilvl="0">
+      <w:start w:val="1"/>
+      <w:numFmt w:val="bullet"/>
+      <w:lvlText w:val=""/>
+      <w:lvlJc w:val="left"/>
+      <w:pPr>
+        <w:tabs>
+          <w:tab w:val="num" w:pos="720"/>
+        </w:tabs>
+        <w:ind w:left="720" w:hanging="360"/>
+      </w:pPr>
+      <w:rPr>
+        <w:rFonts w:ascii="Symbol" w:hAnsi="Symbol" w:hint="default"/>
+        <w:sz w:val="20"/>
+      </w:rPr>
+    </w:lvl>
+    <w:lvl w:ilvl="1" w:tentative="1">
+      <w:start w:val="1"/>
+      <w:numFmt w:val="bullet"/>
+      <w:lvlText w:val="o"/>
+      <w:lvlJc w:val="left"/>
+      <w:pPr>
+        <w:tabs>
+          <w:tab w:val="num" w:pos="1440"/>
+        </w:tabs>
+        <w:ind w:left="1440" w:hanging="360"/>
+      </w:pPr>
+      <w:rPr>
+        <w:rFonts w:ascii="Courier New" w:hAnsi="Courier New" w:hint="default"/>
+        <w:sz w:val="20"/>
+      </w:rPr>
+    </w:lvl>
+    <w:lvl w:ilvl="2" w:tentative="1">
+      <w:start w:val="1"/>
+      <w:numFmt w:val="bullet"/>
+      <w:lvlText w:val=""/>
+      <w:lvlJc w:val="left"/>
+      <w:pPr>
+        <w:tabs>
+          <w:tab w:val="num" w:pos="2160"/>
+        </w:tabs>
+        <w:ind w:left="2160" w:hanging="360"/>
+      </w:pPr>
+      <w:rPr>
+        <w:rFonts w:ascii="Wingdings" w:hAnsi="Wingdings" w:hint="default"/>
+        <w:sz w:val="20"/>
+      </w:rPr>
+    </w:lvl>
+    <w:lvl w:ilvl="3" w:tentative="1">
+      <w:start w:val="1"/>
+      <w:numFmt w:val="bullet"/>
+      <w:lvlText w:val=""/>
+      <w:lvlJc w:val="left"/>
+      <w:pPr>
+        <w:tabs>
+          <w:tab w:val="num" w:pos="2880"/>
+        </w:tabs>
+        <w:ind w:left="2880" w:hanging="360"/>
+      </w:pPr>
+      <w:rPr>
+        <w:rFonts w:ascii="Wingdings" w:hAnsi="Wingdings" w:hint="default"/>
+        <w:sz w:val="20"/>
+      </w:rPr>
+    </w:lvl>
+    <w:lvl w:ilvl="4" w:tentative="1">
+      <w:start w:val="1"/>
+      <w:numFmt w:val="bullet"/>
+      <w:lvlText w:val=""/>
+      <w:lvlJc w:val="left"/>
+      <w:pPr>
+        <w:tabs>
+          <w:tab w:val="num" w:pos="3600"/>
+        </w:tabs>
+        <w:ind w:left="3600" w:hanging="360"/>
+      </w:pPr>
+      <w:rPr>
+        <w:rFonts w:ascii="Wingdings" w:hAnsi="Wingdings" w:hint="default"/>
+        <w:sz w:val="20"/>
+      </w:rPr>
+    </w:lvl>
+    <w:lvl w:ilvl="5" w:tentative="1">
+      <w:start w:val="1"/>
+      <w:numFmt w:val="bullet"/>
+      <w:lvlText w:val=""/>
+      <w:lvlJc w:val="left"/>
+      <w:pPr>
+        <w:tabs>
+          <w:tab w:val="num" w:pos="4320"/>
+        </w:tabs>
+        <w:ind w:left="4320" w:hanging="360"/>
+      </w:pPr>
+      <w:rPr>
+        <w:rFonts w:ascii="Wingdings" w:hAnsi="Wingdings" w:hint="default"/>
+        <w:sz w:val="20"/>
+      </w:rPr>
+    </w:lvl>
+    <w:lvl w:ilvl="6" w:tentative="1">
+      <w:start w:val="1"/>
+      <w:numFmt w:val="bullet"/>
+      <w:lvlText w:val=""/>
+      <w:lvlJc w:val="left"/>
+      <w:pPr>
+        <w:tabs>
+          <w:tab w:val="num" w:pos="5040"/>
+        </w:tabs>
+        <w:ind w:left="5040" w:hanging="360"/>
+      </w:pPr>
+      <w:rPr>
+        <w:rFonts w:ascii="Wingdings" w:hAnsi="Wingdings" w:hint="default"/>
+        <w:sz w:val="20"/>
+      </w:rPr>
+    </w:lvl>
+    <w:lvl w:ilvl="7" w:tentative="1">
+      <w:start w:val="1"/>
+      <w:numFmt w:val="bullet"/>
+      <w:lvlText w:val=""/>
+      <w:lvlJc w:val="left"/>
+      <w:pPr>
+        <w:tabs>
+          <w:tab w:val="num" w:pos="5760"/>
+        </w:tabs>
+        <w:ind w:left="5760" w:hanging="360"/>
+      </w:pPr>
+      <w:rPr>
+        <w:rFonts w:ascii="Wingdings" w:hAnsi="Wingdings" w:hint="default"/>
+        <w:sz w:val="20"/>
+      </w:rPr>
+    </w:lvl>
+    <w:lvl w:ilvl="8" w:tentative="1">
+      <w:start w:val="1"/>
+      <w:numFmt w:val="bullet"/>
+      <w:lvlText w:val=""/>
+      <w:lvlJc w:val="left"/>
+      <w:pPr>
+        <w:tabs>
+          <w:tab w:val="num" w:pos="6480"/>
+        </w:tabs>
+        <w:ind w:left="6480" w:hanging="360"/>
+      </w:pPr>
+      <w:rPr>
+        <w:rFonts w:ascii="Wingdings" w:hAnsi="Wingdings" w:hint="default"/>
+        <w:sz w:val="20"/>
+      </w:rPr>
+    </w:lvl>
+  </w:abstractNum>
+  <w:abstractNum w:abstractNumId="11" w15:restartNumberingAfterBreak="0">
+    <w:nsid w:val="3B586C24"/>
+    <w:multiLevelType w:val="multilevel"/>
+    <w:tmpl w:val="D610CD80"/>
+    <w:lvl w:ilvl="0">
+      <w:start w:val="1"/>
+      <w:numFmt w:val="bullet"/>
+      <w:lvlText w:val=""/>
+      <w:lvlJc w:val="left"/>
+      <w:pPr>
+        <w:tabs>
+          <w:tab w:val="num" w:pos="720"/>
+        </w:tabs>
+        <w:ind w:left="720" w:hanging="360"/>
+      </w:pPr>
+      <w:rPr>
+        <w:rFonts w:ascii="Symbol" w:hAnsi="Symbol" w:hint="default"/>
+        <w:sz w:val="20"/>
+      </w:rPr>
+    </w:lvl>
+    <w:lvl w:ilvl="1" w:tentative="1">
+      <w:start w:val="1"/>
+      <w:numFmt w:val="bullet"/>
+      <w:lvlText w:val="o"/>
+      <w:lvlJc w:val="left"/>
+      <w:pPr>
+        <w:tabs>
+          <w:tab w:val="num" w:pos="1440"/>
+        </w:tabs>
+        <w:ind w:left="1440" w:hanging="360"/>
+      </w:pPr>
+      <w:rPr>
+        <w:rFonts w:ascii="Courier New" w:hAnsi="Courier New" w:hint="default"/>
+        <w:sz w:val="20"/>
+      </w:rPr>
+    </w:lvl>
+    <w:lvl w:ilvl="2" w:tentative="1">
+      <w:start w:val="1"/>
+      <w:numFmt w:val="bullet"/>
+      <w:lvlText w:val=""/>
+      <w:lvlJc w:val="left"/>
+      <w:pPr>
+        <w:tabs>
+          <w:tab w:val="num" w:pos="2160"/>
+        </w:tabs>
+        <w:ind w:left="2160" w:hanging="360"/>
+      </w:pPr>
+      <w:rPr>
+        <w:rFonts w:ascii="Wingdings" w:hAnsi="Wingdings" w:hint="default"/>
+        <w:sz w:val="20"/>
+      </w:rPr>
+    </w:lvl>
+    <w:lvl w:ilvl="3" w:tentative="1">
+      <w:start w:val="1"/>
+      <w:numFmt w:val="bullet"/>
+      <w:lvlText w:val=""/>
+      <w:lvlJc w:val="left"/>
+      <w:pPr>
+        <w:tabs>
+          <w:tab w:val="num" w:pos="2880"/>
+        </w:tabs>
+        <w:ind w:left="2880" w:hanging="360"/>
+      </w:pPr>
+      <w:rPr>
+        <w:rFonts w:ascii="Wingdings" w:hAnsi="Wingdings" w:hint="default"/>
+        <w:sz w:val="20"/>
+      </w:rPr>
+    </w:lvl>
+    <w:lvl w:ilvl="4" w:tentative="1">
+      <w:start w:val="1"/>
+      <w:numFmt w:val="bullet"/>
+      <w:lvlText w:val=""/>
+      <w:lvlJc w:val="left"/>
+      <w:pPr>
+        <w:tabs>
+          <w:tab w:val="num" w:pos="3600"/>
+        </w:tabs>
+        <w:ind w:left="3600" w:hanging="360"/>
+      </w:pPr>
+      <w:rPr>
+        <w:rFonts w:ascii="Wingdings" w:hAnsi="Wingdings" w:hint="default"/>
+        <w:sz w:val="20"/>
+      </w:rPr>
+    </w:lvl>
+    <w:lvl w:ilvl="5" w:tentative="1">
+      <w:start w:val="1"/>
+      <w:numFmt w:val="bullet"/>
+      <w:lvlText w:val=""/>
+      <w:lvlJc w:val="left"/>
+      <w:pPr>
+        <w:tabs>
+          <w:tab w:val="num" w:pos="4320"/>
+        </w:tabs>
+        <w:ind w:left="4320" w:hanging="360"/>
+      </w:pPr>
+      <w:rPr>
+        <w:rFonts w:ascii="Wingdings" w:hAnsi="Wingdings" w:hint="default"/>
+        <w:sz w:val="20"/>
+      </w:rPr>
+    </w:lvl>
+    <w:lvl w:ilvl="6" w:tentative="1">
+      <w:start w:val="1"/>
+      <w:numFmt w:val="bullet"/>
+      <w:lvlText w:val=""/>
+      <w:lvlJc w:val="left"/>
+      <w:pPr>
+        <w:tabs>
+          <w:tab w:val="num" w:pos="5040"/>
+        </w:tabs>
+        <w:ind w:left="5040" w:hanging="360"/>
+      </w:pPr>
+      <w:rPr>
+        <w:rFonts w:ascii="Wingdings" w:hAnsi="Wingdings" w:hint="default"/>
+        <w:sz w:val="20"/>
+      </w:rPr>
+    </w:lvl>
+    <w:lvl w:ilvl="7" w:tentative="1">
+      <w:start w:val="1"/>
+      <w:numFmt w:val="bullet"/>
+      <w:lvlText w:val=""/>
+      <w:lvlJc w:val="left"/>
+      <w:pPr>
+        <w:tabs>
+          <w:tab w:val="num" w:pos="5760"/>
+        </w:tabs>
+        <w:ind w:left="5760" w:hanging="360"/>
+      </w:pPr>
+      <w:rPr>
+        <w:rFonts w:ascii="Wingdings" w:hAnsi="Wingdings" w:hint="default"/>
+        <w:sz w:val="20"/>
+      </w:rPr>
+    </w:lvl>
+    <w:lvl w:ilvl="8" w:tentative="1">
+      <w:start w:val="1"/>
+      <w:numFmt w:val="bullet"/>
+      <w:lvlText w:val=""/>
+      <w:lvlJc w:val="left"/>
+      <w:pPr>
+        <w:tabs>
+          <w:tab w:val="num" w:pos="6480"/>
+        </w:tabs>
+        <w:ind w:left="6480" w:hanging="360"/>
+      </w:pPr>
+      <w:rPr>
+        <w:rFonts w:ascii="Wingdings" w:hAnsi="Wingdings" w:hint="default"/>
+        <w:sz w:val="20"/>
+      </w:rPr>
+    </w:lvl>
+  </w:abstractNum>
+  <w:abstractNum w:abstractNumId="12" w15:restartNumberingAfterBreak="0">
+    <w:nsid w:val="3B811309"/>
+    <w:multiLevelType w:val="hybridMultilevel"/>
+    <w:tmpl w:val="738A03E6"/>
+    <w:lvl w:ilvl="0" w:tplc="0409000F">
+      <w:start w:val="1"/>
+      <w:numFmt w:val="decimal"/>
+      <w:lvlText w:val="%1."/>
+      <w:lvlJc w:val="left"/>
+      <w:pPr>
+        <w:ind w:left="360" w:hanging="360"/>
+      </w:pPr>
+    </w:lvl>
+    <w:lvl w:ilvl="1" w:tplc="04090019" w:tentative="1">
+      <w:start w:val="1"/>
+      <w:numFmt w:val="lowerLetter"/>
+      <w:lvlText w:val="%2."/>
+      <w:lvlJc w:val="left"/>
+      <w:pPr>
+        <w:ind w:left="1080" w:hanging="360"/>
+      </w:pPr>
+    </w:lvl>
+    <w:lvl w:ilvl="2" w:tplc="0409001B" w:tentative="1">
+      <w:start w:val="1"/>
+      <w:numFmt w:val="lowerRoman"/>
+      <w:lvlText w:val="%3."/>
+      <w:lvlJc w:val="right"/>
+      <w:pPr>
+        <w:ind w:left="1800" w:hanging="180"/>
+      </w:pPr>
+    </w:lvl>
+    <w:lvl w:ilvl="3" w:tplc="0409000F" w:tentative="1">
+      <w:start w:val="1"/>
+      <w:numFmt w:val="decimal"/>
+      <w:lvlText w:val="%4."/>
+      <w:lvlJc w:val="left"/>
+      <w:pPr>
+        <w:ind w:left="2520" w:hanging="360"/>
+      </w:pPr>
+    </w:lvl>
+    <w:lvl w:ilvl="4" w:tplc="04090019" w:tentative="1">
+      <w:start w:val="1"/>
+      <w:numFmt w:val="lowerLetter"/>
+      <w:lvlText w:val="%5."/>
+      <w:lvlJc w:val="left"/>
+      <w:pPr>
+        <w:ind w:left="3240" w:hanging="360"/>
+      </w:pPr>
+    </w:lvl>
+    <w:lvl w:ilvl="5" w:tplc="0409001B" w:tentative="1">
+      <w:start w:val="1"/>
+      <w:numFmt w:val="lowerRoman"/>
+      <w:lvlText w:val="%6."/>
+      <w:lvlJc w:val="right"/>
+      <w:pPr>
+        <w:ind w:left="3960" w:hanging="180"/>
+      </w:pPr>
+    </w:lvl>
+    <w:lvl w:ilvl="6" w:tplc="0409000F" w:tentative="1">
+      <w:start w:val="1"/>
+      <w:numFmt w:val="decimal"/>
+      <w:lvlText w:val="%7."/>
+      <w:lvlJc w:val="left"/>
+      <w:pPr>
+        <w:ind w:left="4680" w:hanging="360"/>
+      </w:pPr>
+    </w:lvl>
+    <w:lvl w:ilvl="7" w:tplc="04090019" w:tentative="1">
+      <w:start w:val="1"/>
+      <w:numFmt w:val="lowerLetter"/>
+      <w:lvlText w:val="%8."/>
+      <w:lvlJc w:val="left"/>
+      <w:pPr>
+        <w:ind w:left="5400" w:hanging="360"/>
+      </w:pPr>
+    </w:lvl>
+    <w:lvl w:ilvl="8" w:tplc="0409001B" w:tentative="1">
+      <w:start w:val="1"/>
+      <w:numFmt w:val="lowerRoman"/>
+      <w:lvlText w:val="%9."/>
+      <w:lvlJc w:val="right"/>
+      <w:pPr>
+        <w:ind w:left="6120" w:hanging="180"/>
+      </w:pPr>
+    </w:lvl>
+  </w:abstractNum>
+  <w:abstractNum w:abstractNumId="13" w15:restartNumberingAfterBreak="0">
+    <w:nsid w:val="3C3D2A33"/>
+    <w:multiLevelType w:val="multilevel"/>
+    <w:tmpl w:val="288018DC"/>
+    <w:lvl w:ilvl="0">
+      <w:start w:val="1"/>
+      <w:numFmt w:val="bullet"/>
+      <w:lvlText w:val=""/>
+      <w:lvlJc w:val="left"/>
+      <w:pPr>
+        <w:tabs>
+          <w:tab w:val="num" w:pos="720"/>
+        </w:tabs>
+        <w:ind w:left="720" w:hanging="360"/>
+      </w:pPr>
+      <w:rPr>
+        <w:rFonts w:ascii="Symbol" w:hAnsi="Symbol" w:hint="default"/>
+        <w:sz w:val="20"/>
+      </w:rPr>
+    </w:lvl>
+    <w:lvl w:ilvl="1" w:tentative="1">
+      <w:start w:val="1"/>
+      <w:numFmt w:val="bullet"/>
+      <w:lvlText w:val="o"/>
+      <w:lvlJc w:val="left"/>
+      <w:pPr>
+        <w:tabs>
+          <w:tab w:val="num" w:pos="1440"/>
+        </w:tabs>
+        <w:ind w:left="1440" w:hanging="360"/>
+      </w:pPr>
+      <w:rPr>
+        <w:rFonts w:ascii="Courier New" w:hAnsi="Courier New" w:hint="default"/>
+        <w:sz w:val="20"/>
+      </w:rPr>
+    </w:lvl>
+    <w:lvl w:ilvl="2" w:tentative="1">
+      <w:start w:val="1"/>
+      <w:numFmt w:val="bullet"/>
+      <w:lvlText w:val=""/>
+      <w:lvlJc w:val="left"/>
+      <w:pPr>
+        <w:tabs>
+          <w:tab w:val="num" w:pos="2160"/>
+        </w:tabs>
+        <w:ind w:left="2160" w:hanging="360"/>
+      </w:pPr>
+      <w:rPr>
+        <w:rFonts w:ascii="Wingdings" w:hAnsi="Wingdings" w:hint="default"/>
+        <w:sz w:val="20"/>
+      </w:rPr>
+    </w:lvl>
+    <w:lvl w:ilvl="3" w:tentative="1">
+      <w:start w:val="1"/>
+      <w:numFmt w:val="bullet"/>
+      <w:lvlText w:val=""/>
+      <w:lvlJc w:val="left"/>
+      <w:pPr>
+        <w:tabs>
+          <w:tab w:val="num" w:pos="2880"/>
+        </w:tabs>
+        <w:ind w:left="2880" w:hanging="360"/>
+      </w:pPr>
+      <w:rPr>
+        <w:rFonts w:ascii="Wingdings" w:hAnsi="Wingdings" w:hint="default"/>
+        <w:sz w:val="20"/>
+      </w:rPr>
+    </w:lvl>
+    <w:lvl w:ilvl="4" w:tentative="1">
+      <w:start w:val="1"/>
+      <w:numFmt w:val="bullet"/>
+      <w:lvlText w:val=""/>
+      <w:lvlJc w:val="left"/>
+      <w:pPr>
+        <w:tabs>
+          <w:tab w:val="num" w:pos="3600"/>
+        </w:tabs>
+        <w:ind w:left="3600" w:hanging="360"/>
+      </w:pPr>
+      <w:rPr>
+        <w:rFonts w:ascii="Wingdings" w:hAnsi="Wingdings" w:hint="default"/>
+        <w:sz w:val="20"/>
+      </w:rPr>
+    </w:lvl>
+    <w:lvl w:ilvl="5" w:tentative="1">
+      <w:start w:val="1"/>
+      <w:numFmt w:val="bullet"/>
+      <w:lvlText w:val=""/>
+      <w:lvlJc w:val="left"/>
+      <w:pPr>
+        <w:tabs>
+          <w:tab w:val="num" w:pos="4320"/>
+        </w:tabs>
+        <w:ind w:left="4320" w:hanging="360"/>
+      </w:pPr>
+      <w:rPr>
+        <w:rFonts w:ascii="Wingdings" w:hAnsi="Wingdings" w:hint="default"/>
+        <w:sz w:val="20"/>
+      </w:rPr>
+    </w:lvl>
+    <w:lvl w:ilvl="6" w:tentative="1">
+      <w:start w:val="1"/>
+      <w:numFmt w:val="bullet"/>
+      <w:lvlText w:val=""/>
+      <w:lvlJc w:val="left"/>
+      <w:pPr>
+        <w:tabs>
+          <w:tab w:val="num" w:pos="5040"/>
+        </w:tabs>
+        <w:ind w:left="5040" w:hanging="360"/>
+      </w:pPr>
+      <w:rPr>
+        <w:rFonts w:ascii="Wingdings" w:hAnsi="Wingdings" w:hint="default"/>
+        <w:sz w:val="20"/>
+      </w:rPr>
+    </w:lvl>
+    <w:lvl w:ilvl="7" w:tentative="1">
+      <w:start w:val="1"/>
+      <w:numFmt w:val="bullet"/>
+      <w:lvlText w:val=""/>
+      <w:lvlJc w:val="left"/>
+      <w:pPr>
+        <w:tabs>
+          <w:tab w:val="num" w:pos="5760"/>
+        </w:tabs>
+        <w:ind w:left="5760" w:hanging="360"/>
+      </w:pPr>
+      <w:rPr>
+        <w:rFonts w:ascii="Wingdings" w:hAnsi="Wingdings" w:hint="default"/>
+        <w:sz w:val="20"/>
+      </w:rPr>
+    </w:lvl>
+    <w:lvl w:ilvl="8" w:tentative="1">
+      <w:start w:val="1"/>
+      <w:numFmt w:val="bullet"/>
+      <w:lvlText w:val=""/>
+      <w:lvlJc w:val="left"/>
+      <w:pPr>
+        <w:tabs>
+          <w:tab w:val="num" w:pos="6480"/>
+        </w:tabs>
+        <w:ind w:left="6480" w:hanging="360"/>
+      </w:pPr>
+      <w:rPr>
+        <w:rFonts w:ascii="Wingdings" w:hAnsi="Wingdings" w:hint="default"/>
+        <w:sz w:val="20"/>
+      </w:rPr>
+    </w:lvl>
+  </w:abstractNum>
+  <w:abstractNum w:abstractNumId="14" w15:restartNumberingAfterBreak="0">
     <w:nsid w:val="5624692A"/>
     <w:multiLevelType w:val="multilevel"/>
     <w:tmpl w:val="A10CDC28"/>
@@ -1933,7 +5741,7 @@
       </w:rPr>
     </w:lvl>
   </w:abstractNum>
-  <w:abstractNum w:abstractNumId="9" w15:restartNumberingAfterBreak="0">
+  <w:abstractNum w:abstractNumId="15" w15:restartNumberingAfterBreak="0">
     <w:nsid w:val="57D72B94"/>
     <w:multiLevelType w:val="hybridMultilevel"/>
     <w:tmpl w:val="13F622C6"/>
@@ -2046,7 +5854,7 @@
       </w:rPr>
     </w:lvl>
   </w:abstractNum>
-  <w:abstractNum w:abstractNumId="10" w15:restartNumberingAfterBreak="0">
+  <w:abstractNum w:abstractNumId="16" w15:restartNumberingAfterBreak="0">
     <w:nsid w:val="59C11A1E"/>
     <w:multiLevelType w:val="multilevel"/>
     <w:tmpl w:val="715C7AF6"/>
@@ -2195,7 +6003,268 @@
       </w:rPr>
     </w:lvl>
   </w:abstractNum>
-  <w:abstractNum w:abstractNumId="11" w15:restartNumberingAfterBreak="0">
+  <w:abstractNum w:abstractNumId="17" w15:restartNumberingAfterBreak="0">
+    <w:nsid w:val="59E60E99"/>
+    <w:multiLevelType w:val="multilevel"/>
+    <w:tmpl w:val="8456472C"/>
+    <w:lvl w:ilvl="0">
+      <w:start w:val="1"/>
+      <w:numFmt w:val="bullet"/>
+      <w:lvlText w:val=""/>
+      <w:lvlJc w:val="left"/>
+      <w:pPr>
+        <w:tabs>
+          <w:tab w:val="num" w:pos="720"/>
+        </w:tabs>
+        <w:ind w:left="720" w:hanging="360"/>
+      </w:pPr>
+      <w:rPr>
+        <w:rFonts w:ascii="Symbol" w:hAnsi="Symbol" w:hint="default"/>
+        <w:sz w:val="20"/>
+      </w:rPr>
+    </w:lvl>
+    <w:lvl w:ilvl="1" w:tentative="1">
+      <w:start w:val="1"/>
+      <w:numFmt w:val="bullet"/>
+      <w:lvlText w:val="o"/>
+      <w:lvlJc w:val="left"/>
+      <w:pPr>
+        <w:tabs>
+          <w:tab w:val="num" w:pos="1440"/>
+        </w:tabs>
+        <w:ind w:left="1440" w:hanging="360"/>
+      </w:pPr>
+      <w:rPr>
+        <w:rFonts w:ascii="Courier New" w:hAnsi="Courier New" w:hint="default"/>
+        <w:sz w:val="20"/>
+      </w:rPr>
+    </w:lvl>
+    <w:lvl w:ilvl="2" w:tentative="1">
+      <w:start w:val="1"/>
+      <w:numFmt w:val="bullet"/>
+      <w:lvlText w:val=""/>
+      <w:lvlJc w:val="left"/>
+      <w:pPr>
+        <w:tabs>
+          <w:tab w:val="num" w:pos="2160"/>
+        </w:tabs>
+        <w:ind w:left="2160" w:hanging="360"/>
+      </w:pPr>
+      <w:rPr>
+        <w:rFonts w:ascii="Wingdings" w:hAnsi="Wingdings" w:hint="default"/>
+        <w:sz w:val="20"/>
+      </w:rPr>
+    </w:lvl>
+    <w:lvl w:ilvl="3" w:tentative="1">
+      <w:start w:val="1"/>
+      <w:numFmt w:val="bullet"/>
+      <w:lvlText w:val=""/>
+      <w:lvlJc w:val="left"/>
+      <w:pPr>
+        <w:tabs>
+          <w:tab w:val="num" w:pos="2880"/>
+        </w:tabs>
+        <w:ind w:left="2880" w:hanging="360"/>
+      </w:pPr>
+      <w:rPr>
+        <w:rFonts w:ascii="Wingdings" w:hAnsi="Wingdings" w:hint="default"/>
+        <w:sz w:val="20"/>
+      </w:rPr>
+    </w:lvl>
+    <w:lvl w:ilvl="4" w:tentative="1">
+      <w:start w:val="1"/>
+      <w:numFmt w:val="bullet"/>
+      <w:lvlText w:val=""/>
+      <w:lvlJc w:val="left"/>
+      <w:pPr>
+        <w:tabs>
+          <w:tab w:val="num" w:pos="3600"/>
+        </w:tabs>
+        <w:ind w:left="3600" w:hanging="360"/>
+      </w:pPr>
+      <w:rPr>
+        <w:rFonts w:ascii="Wingdings" w:hAnsi="Wingdings" w:hint="default"/>
+        <w:sz w:val="20"/>
+      </w:rPr>
+    </w:lvl>
+    <w:lvl w:ilvl="5" w:tentative="1">
+      <w:start w:val="1"/>
+      <w:numFmt w:val="bullet"/>
+      <w:lvlText w:val=""/>
+      <w:lvlJc w:val="left"/>
+      <w:pPr>
+        <w:tabs>
+          <w:tab w:val="num" w:pos="4320"/>
+        </w:tabs>
+        <w:ind w:left="4320" w:hanging="360"/>
+      </w:pPr>
+      <w:rPr>
+        <w:rFonts w:ascii="Wingdings" w:hAnsi="Wingdings" w:hint="default"/>
+        <w:sz w:val="20"/>
+      </w:rPr>
+    </w:lvl>
+    <w:lvl w:ilvl="6" w:tentative="1">
+      <w:start w:val="1"/>
+      <w:numFmt w:val="bullet"/>
+      <w:lvlText w:val=""/>
+      <w:lvlJc w:val="left"/>
+      <w:pPr>
+        <w:tabs>
+          <w:tab w:val="num" w:pos="5040"/>
+        </w:tabs>
+        <w:ind w:left="5040" w:hanging="360"/>
+      </w:pPr>
+      <w:rPr>
+        <w:rFonts w:ascii="Wingdings" w:hAnsi="Wingdings" w:hint="default"/>
+        <w:sz w:val="20"/>
+      </w:rPr>
+    </w:lvl>
+    <w:lvl w:ilvl="7" w:tentative="1">
+      <w:start w:val="1"/>
+      <w:numFmt w:val="bullet"/>
+      <w:lvlText w:val=""/>
+      <w:lvlJc w:val="left"/>
+      <w:pPr>
+        <w:tabs>
+          <w:tab w:val="num" w:pos="5760"/>
+        </w:tabs>
+        <w:ind w:left="5760" w:hanging="360"/>
+      </w:pPr>
+      <w:rPr>
+        <w:rFonts w:ascii="Wingdings" w:hAnsi="Wingdings" w:hint="default"/>
+        <w:sz w:val="20"/>
+      </w:rPr>
+    </w:lvl>
+    <w:lvl w:ilvl="8" w:tentative="1">
+      <w:start w:val="1"/>
+      <w:numFmt w:val="bullet"/>
+      <w:lvlText w:val=""/>
+      <w:lvlJc w:val="left"/>
+      <w:pPr>
+        <w:tabs>
+          <w:tab w:val="num" w:pos="6480"/>
+        </w:tabs>
+        <w:ind w:left="6480" w:hanging="360"/>
+      </w:pPr>
+      <w:rPr>
+        <w:rFonts w:ascii="Wingdings" w:hAnsi="Wingdings" w:hint="default"/>
+        <w:sz w:val="20"/>
+      </w:rPr>
+    </w:lvl>
+  </w:abstractNum>
+  <w:abstractNum w:abstractNumId="18" w15:restartNumberingAfterBreak="0">
+    <w:nsid w:val="69E77F7B"/>
+    <w:multiLevelType w:val="hybridMultilevel"/>
+    <w:tmpl w:val="DD5EEC5A"/>
+    <w:lvl w:ilvl="0" w:tplc="E7065CF6">
+      <w:numFmt w:val="bullet"/>
+      <w:lvlText w:val=""/>
+      <w:lvlJc w:val="left"/>
+      <w:pPr>
+        <w:ind w:left="765" w:hanging="405"/>
+      </w:pPr>
+      <w:rPr>
+        <w:rFonts w:ascii="Times New Roman" w:eastAsiaTheme="minorHAnsi" w:hAnsi="Times New Roman" w:cs="Times New Roman" w:hint="default"/>
+      </w:rPr>
+    </w:lvl>
+    <w:lvl w:ilvl="1" w:tplc="04090003" w:tentative="1">
+      <w:start w:val="1"/>
+      <w:numFmt w:val="bullet"/>
+      <w:lvlText w:val="o"/>
+      <w:lvlJc w:val="left"/>
+      <w:pPr>
+        <w:ind w:left="1440" w:hanging="360"/>
+      </w:pPr>
+      <w:rPr>
+        <w:rFonts w:ascii="Courier New" w:hAnsi="Courier New" w:cs="Courier New" w:hint="default"/>
+      </w:rPr>
+    </w:lvl>
+    <w:lvl w:ilvl="2" w:tplc="04090005" w:tentative="1">
+      <w:start w:val="1"/>
+      <w:numFmt w:val="bullet"/>
+      <w:lvlText w:val=""/>
+      <w:lvlJc w:val="left"/>
+      <w:pPr>
+        <w:ind w:left="2160" w:hanging="360"/>
+      </w:pPr>
+      <w:rPr>
+        <w:rFonts w:ascii="Wingdings" w:hAnsi="Wingdings" w:hint="default"/>
+      </w:rPr>
+    </w:lvl>
+    <w:lvl w:ilvl="3" w:tplc="04090001" w:tentative="1">
+      <w:start w:val="1"/>
+      <w:numFmt w:val="bullet"/>
+      <w:lvlText w:val=""/>
+      <w:lvlJc w:val="left"/>
+      <w:pPr>
+        <w:ind w:left="2880" w:hanging="360"/>
+      </w:pPr>
+      <w:rPr>
+        <w:rFonts w:ascii="Symbol" w:hAnsi="Symbol" w:hint="default"/>
+      </w:rPr>
+    </w:lvl>
+    <w:lvl w:ilvl="4" w:tplc="04090003" w:tentative="1">
+      <w:start w:val="1"/>
+      <w:numFmt w:val="bullet"/>
+      <w:lvlText w:val="o"/>
+      <w:lvlJc w:val="left"/>
+      <w:pPr>
+        <w:ind w:left="3600" w:hanging="360"/>
+      </w:pPr>
+      <w:rPr>
+        <w:rFonts w:ascii="Courier New" w:hAnsi="Courier New" w:cs="Courier New" w:hint="default"/>
+      </w:rPr>
+    </w:lvl>
+    <w:lvl w:ilvl="5" w:tplc="04090005" w:tentative="1">
+      <w:start w:val="1"/>
+      <w:numFmt w:val="bullet"/>
+      <w:lvlText w:val=""/>
+      <w:lvlJc w:val="left"/>
+      <w:pPr>
+        <w:ind w:left="4320" w:hanging="360"/>
+      </w:pPr>
+      <w:rPr>
+        <w:rFonts w:ascii="Wingdings" w:hAnsi="Wingdings" w:hint="default"/>
+      </w:rPr>
+    </w:lvl>
+    <w:lvl w:ilvl="6" w:tplc="04090001" w:tentative="1">
+      <w:start w:val="1"/>
+      <w:numFmt w:val="bullet"/>
+      <w:lvlText w:val=""/>
+      <w:lvlJc w:val="left"/>
+      <w:pPr>
+        <w:ind w:left="5040" w:hanging="360"/>
+      </w:pPr>
+      <w:rPr>
+        <w:rFonts w:ascii="Symbol" w:hAnsi="Symbol" w:hint="default"/>
+      </w:rPr>
+    </w:lvl>
+    <w:lvl w:ilvl="7" w:tplc="04090003" w:tentative="1">
+      <w:start w:val="1"/>
+      <w:numFmt w:val="bullet"/>
+      <w:lvlText w:val="o"/>
+      <w:lvlJc w:val="left"/>
+      <w:pPr>
+        <w:ind w:left="5760" w:hanging="360"/>
+      </w:pPr>
+      <w:rPr>
+        <w:rFonts w:ascii="Courier New" w:hAnsi="Courier New" w:cs="Courier New" w:hint="default"/>
+      </w:rPr>
+    </w:lvl>
+    <w:lvl w:ilvl="8" w:tplc="04090005" w:tentative="1">
+      <w:start w:val="1"/>
+      <w:numFmt w:val="bullet"/>
+      <w:lvlText w:val=""/>
+      <w:lvlJc w:val="left"/>
+      <w:pPr>
+        <w:ind w:left="6480" w:hanging="360"/>
+      </w:pPr>
+      <w:rPr>
+        <w:rFonts w:ascii="Wingdings" w:hAnsi="Wingdings" w:hint="default"/>
+      </w:rPr>
+    </w:lvl>
+  </w:abstractNum>
+  <w:abstractNum w:abstractNumId="19" w15:restartNumberingAfterBreak="0">
     <w:nsid w:val="70C20175"/>
     <w:multiLevelType w:val="hybridMultilevel"/>
     <w:tmpl w:val="56BAA96E"/>
@@ -2307,7 +6376,119 @@
       </w:rPr>
     </w:lvl>
   </w:abstractNum>
-  <w:abstractNum w:abstractNumId="12" w15:restartNumberingAfterBreak="0">
+  <w:abstractNum w:abstractNumId="20" w15:restartNumberingAfterBreak="0">
+    <w:nsid w:val="72585E65"/>
+    <w:multiLevelType w:val="hybridMultilevel"/>
+    <w:tmpl w:val="7A325992"/>
+    <w:lvl w:ilvl="0" w:tplc="D4A68E7A">
+      <w:numFmt w:val="bullet"/>
+      <w:lvlText w:val=""/>
+      <w:lvlJc w:val="left"/>
+      <w:pPr>
+        <w:ind w:left="765" w:hanging="405"/>
+      </w:pPr>
+      <w:rPr>
+        <w:rFonts w:ascii="Times New Roman" w:eastAsiaTheme="minorHAnsi" w:hAnsi="Times New Roman" w:cs="Times New Roman" w:hint="default"/>
+      </w:rPr>
+    </w:lvl>
+    <w:lvl w:ilvl="1" w:tplc="04090003" w:tentative="1">
+      <w:start w:val="1"/>
+      <w:numFmt w:val="bullet"/>
+      <w:lvlText w:val="o"/>
+      <w:lvlJc w:val="left"/>
+      <w:pPr>
+        <w:ind w:left="1440" w:hanging="360"/>
+      </w:pPr>
+      <w:rPr>
+        <w:rFonts w:ascii="Courier New" w:hAnsi="Courier New" w:cs="Courier New" w:hint="default"/>
+      </w:rPr>
+    </w:lvl>
+    <w:lvl w:ilvl="2" w:tplc="04090005" w:tentative="1">
+      <w:start w:val="1"/>
+      <w:numFmt w:val="bullet"/>
+      <w:lvlText w:val=""/>
+      <w:lvlJc w:val="left"/>
+      <w:pPr>
+        <w:ind w:left="2160" w:hanging="360"/>
+      </w:pPr>
+      <w:rPr>
+        <w:rFonts w:ascii="Wingdings" w:hAnsi="Wingdings" w:hint="default"/>
+      </w:rPr>
+    </w:lvl>
+    <w:lvl w:ilvl="3" w:tplc="04090001" w:tentative="1">
+      <w:start w:val="1"/>
+      <w:numFmt w:val="bullet"/>
+      <w:lvlText w:val=""/>
+      <w:lvlJc w:val="left"/>
+      <w:pPr>
+        <w:ind w:left="2880" w:hanging="360"/>
+      </w:pPr>
+      <w:rPr>
+        <w:rFonts w:ascii="Symbol" w:hAnsi="Symbol" w:hint="default"/>
+      </w:rPr>
+    </w:lvl>
+    <w:lvl w:ilvl="4" w:tplc="04090003" w:tentative="1">
+      <w:start w:val="1"/>
+      <w:numFmt w:val="bullet"/>
+      <w:lvlText w:val="o"/>
+      <w:lvlJc w:val="left"/>
+      <w:pPr>
+        <w:ind w:left="3600" w:hanging="360"/>
+      </w:pPr>
+      <w:rPr>
+        <w:rFonts w:ascii="Courier New" w:hAnsi="Courier New" w:cs="Courier New" w:hint="default"/>
+      </w:rPr>
+    </w:lvl>
+    <w:lvl w:ilvl="5" w:tplc="04090005" w:tentative="1">
+      <w:start w:val="1"/>
+      <w:numFmt w:val="bullet"/>
+      <w:lvlText w:val=""/>
+      <w:lvlJc w:val="left"/>
+      <w:pPr>
+        <w:ind w:left="4320" w:hanging="360"/>
+      </w:pPr>
+      <w:rPr>
+        <w:rFonts w:ascii="Wingdings" w:hAnsi="Wingdings" w:hint="default"/>
+      </w:rPr>
+    </w:lvl>
+    <w:lvl w:ilvl="6" w:tplc="04090001" w:tentative="1">
+      <w:start w:val="1"/>
+      <w:numFmt w:val="bullet"/>
+      <w:lvlText w:val=""/>
+      <w:lvlJc w:val="left"/>
+      <w:pPr>
+        <w:ind w:left="5040" w:hanging="360"/>
+      </w:pPr>
+      <w:rPr>
+        <w:rFonts w:ascii="Symbol" w:hAnsi="Symbol" w:hint="default"/>
+      </w:rPr>
+    </w:lvl>
+    <w:lvl w:ilvl="7" w:tplc="04090003" w:tentative="1">
+      <w:start w:val="1"/>
+      <w:numFmt w:val="bullet"/>
+      <w:lvlText w:val="o"/>
+      <w:lvlJc w:val="left"/>
+      <w:pPr>
+        <w:ind w:left="5760" w:hanging="360"/>
+      </w:pPr>
+      <w:rPr>
+        <w:rFonts w:ascii="Courier New" w:hAnsi="Courier New" w:cs="Courier New" w:hint="default"/>
+      </w:rPr>
+    </w:lvl>
+    <w:lvl w:ilvl="8" w:tplc="04090005" w:tentative="1">
+      <w:start w:val="1"/>
+      <w:numFmt w:val="bullet"/>
+      <w:lvlText w:val=""/>
+      <w:lvlJc w:val="left"/>
+      <w:pPr>
+        <w:ind w:left="6480" w:hanging="360"/>
+      </w:pPr>
+      <w:rPr>
+        <w:rFonts w:ascii="Wingdings" w:hAnsi="Wingdings" w:hint="default"/>
+      </w:rPr>
+    </w:lvl>
+  </w:abstractNum>
+  <w:abstractNum w:abstractNumId="21" w15:restartNumberingAfterBreak="0">
     <w:nsid w:val="73E02042"/>
     <w:multiLevelType w:val="multilevel"/>
     <w:tmpl w:val="6C9651B6"/>
@@ -2457,16 +6638,16 @@
     </w:lvl>
   </w:abstractNum>
   <w:num w:numId="1" w16cid:durableId="960499695">
-    <w:abstractNumId w:val="7"/>
+    <w:abstractNumId w:val="9"/>
   </w:num>
   <w:num w:numId="2" w16cid:durableId="1072703119">
-    <w:abstractNumId w:val="8"/>
+    <w:abstractNumId w:val="14"/>
   </w:num>
   <w:num w:numId="3" w16cid:durableId="330183495">
-    <w:abstractNumId w:val="12"/>
+    <w:abstractNumId w:val="21"/>
   </w:num>
   <w:num w:numId="4" w16cid:durableId="1498614195">
-    <w:abstractNumId w:val="10"/>
+    <w:abstractNumId w:val="16"/>
   </w:num>
   <w:num w:numId="5" w16cid:durableId="1553493830">
     <w:abstractNumId w:val="3"/>
@@ -2475,25 +6656,52 @@
     <w:abstractNumId w:val="2"/>
   </w:num>
   <w:num w:numId="7" w16cid:durableId="430130054">
-    <w:abstractNumId w:val="6"/>
+    <w:abstractNumId w:val="7"/>
   </w:num>
   <w:num w:numId="8" w16cid:durableId="1273823523">
     <w:abstractNumId w:val="1"/>
   </w:num>
   <w:num w:numId="9" w16cid:durableId="420176741">
-    <w:abstractNumId w:val="11"/>
+    <w:abstractNumId w:val="19"/>
   </w:num>
   <w:num w:numId="10" w16cid:durableId="831213937">
-    <w:abstractNumId w:val="5"/>
+    <w:abstractNumId w:val="6"/>
   </w:num>
   <w:num w:numId="11" w16cid:durableId="1683706263">
-    <w:abstractNumId w:val="9"/>
+    <w:abstractNumId w:val="15"/>
   </w:num>
   <w:num w:numId="12" w16cid:durableId="1343388003">
-    <w:abstractNumId w:val="4"/>
+    <w:abstractNumId w:val="5"/>
   </w:num>
   <w:num w:numId="13" w16cid:durableId="202862730">
     <w:abstractNumId w:val="0"/>
+  </w:num>
+  <w:num w:numId="14" w16cid:durableId="1682077772">
+    <w:abstractNumId w:val="12"/>
+  </w:num>
+  <w:num w:numId="15" w16cid:durableId="1056859346">
+    <w:abstractNumId w:val="4"/>
+  </w:num>
+  <w:num w:numId="16" w16cid:durableId="1061441410">
+    <w:abstractNumId w:val="18"/>
+  </w:num>
+  <w:num w:numId="17" w16cid:durableId="704403216">
+    <w:abstractNumId w:val="8"/>
+  </w:num>
+  <w:num w:numId="18" w16cid:durableId="315764117">
+    <w:abstractNumId w:val="20"/>
+  </w:num>
+  <w:num w:numId="19" w16cid:durableId="174422407">
+    <w:abstractNumId w:val="13"/>
+  </w:num>
+  <w:num w:numId="20" w16cid:durableId="1723402325">
+    <w:abstractNumId w:val="17"/>
+  </w:num>
+  <w:num w:numId="21" w16cid:durableId="266087754">
+    <w:abstractNumId w:val="11"/>
+  </w:num>
+  <w:num w:numId="22" w16cid:durableId="333344343">
+    <w:abstractNumId w:val="10"/>
   </w:num>
 </w:numbering>
 </file>
@@ -3102,7 +7310,6 @@
   <w:style w:type="character" w:default="1" w:styleId="DefaultParagraphFont">
     <w:name w:val="Default Paragraph Font"/>
     <w:uiPriority w:val="1"/>
-    <w:semiHidden/>
     <w:unhideWhenUsed/>
   </w:style>
   <w:style w:type="table" w:default="1" w:styleId="TableNormal">

</xml_diff>